<commit_message>
Firma manuscrita en consentimientos: canvas en el modal, estampada en el PDF
- consent_generator: sustituye {{firma_paciente}}/{{firma_tutor}} por la imagen de
  la firma a ancho fijo (5cm); si no hay firma limpia el marcador. Firma dentro del PDF
- documents.py sign_consent: acepta firma_paciente/firma_tutor (PNG base64); valida
  firma paciente siempre y firma tutor si hay datos de tutor. Revocacion sin firma
- documents.html: canvas de firma grande (dedo/raton, pointer events) con Borrar; el
  canvas del tutor aparece si se rellena el nombre del tutor
- Plantillas .docx con los marcadores de firma
</commit_message>
<xml_diff>
--- a/app/static/docs/CI FISIOTERAPIA GENERAL.docx
+++ b/app/static/docs/CI FISIOTERAPIA GENERAL.docx
@@ -321,7 +321,6 @@
           <w:sz w:val="24"/>
           <w:szCs w:val="24"/>
         </w:rPr>
-        <w:lastRenderedPageBreak/>
         <w:t>Hidroterapia:</w:t>
       </w:r>
       <w:r>
@@ -794,7 +793,6 @@
         <w:rPr>
           <w:rFonts w:ascii="Century Gothic" w:hAnsi="Century Gothic"/>
         </w:rPr>
-        <w:lastRenderedPageBreak/>
         <w:t>Estados febriles y/o de debilidad extrema</w:t>
       </w:r>
     </w:p>
@@ -1278,7 +1276,6 @@
         <w:rPr>
           <w:rFonts w:ascii="Century Gothic" w:hAnsi="Century Gothic"/>
         </w:rPr>
-        <w:lastRenderedPageBreak/>
         <w:t xml:space="preserve">declaro haber facilitado al paciente y/o persona autorizada toda la información necesaria para la realización de los tratamientos expuestos en el presente documento y declaro haber confirmado, inmediatamente </w:t>
       </w:r>
       <w:r>
@@ -1751,6 +1748,11 @@
           <w:rFonts w:ascii="Century Gothic" w:hAnsi="Century Gothic"/>
         </w:rPr>
         <w:br/>
+      </w:r>
+      <w:r>
+        <w:rPr>
+          <w:rFonts w:ascii="Century Gothic" w:hAnsi="Century Gothic"/>
+        </w:rPr>
         <w:t>{{observaciones</w:t>
       </w:r>
       <w:r>
@@ -1777,9 +1779,6 @@
     <w:p>
       <w:pPr>
         <w:ind w:firstLine="0"/>
-        <w:rPr>
-          <w:rFonts w:ascii="Century Gothic" w:hAnsi="Century Gothic"/>
-        </w:rPr>
       </w:pPr>
       <w:r>
         <w:rPr>
@@ -1834,12 +1833,102 @@
           <w:rFonts w:ascii="Century Gothic" w:hAnsi="Century Gothic"/>
         </w:rPr>
         <w:t>}}</w:t>
+      </w:r>
+    </w:p>
+    <w:p>
+      <w:pPr>
+        <w:ind w:firstLine="0"/>
+        <w:rPr>
+          <w:rFonts w:ascii="Century Gothic" w:hAnsi="Century Gothic"/>
+        </w:rPr>
+      </w:pPr>
+    </w:p>
+    <w:p>
+      <w:pPr>
+        <w:ind w:firstLine="0"/>
+        <w:rPr>
+          <w:rFonts w:ascii="Century Gothic" w:hAnsi="Century Gothic"/>
+        </w:rPr>
+      </w:pPr>
+    </w:p>
+    <w:p>
+      <w:pPr>
+        <w:ind w:firstLine="0"/>
+        <w:rPr>
+          <w:rFonts w:ascii="Century Gothic" w:hAnsi="Century Gothic"/>
+        </w:rPr>
+      </w:pPr>
+    </w:p>
+    <w:p>
+      <w:pPr>
+        <w:ind w:firstLine="0"/>
+        <w:rPr>
+          <w:rFonts w:ascii="Century Gothic" w:hAnsi="Century Gothic"/>
+        </w:rPr>
+      </w:pPr>
+    </w:p>
+    <w:p>
+      <w:pPr>
+        <w:pStyle w:val="Normal"/>
+        <w:suppressLineNumbers w:val="0"/>
+        <w:bidi w:val="0"/>
+        <w:spacing w:before="0" w:beforeAutospacing="off" w:after="200" w:afterAutospacing="off" w:line="259" w:lineRule="auto"/>
+        <w:ind w:left="0" w:right="0"/>
+        <w:jc w:val="left"/>
+      </w:pPr>
+      <w:r>
+        <w:rPr>
+          <w:rFonts w:ascii="Century Gothic" w:hAnsi="Century Gothic"/>
+        </w:rPr>
+        <w:t>{{</w:t>
+      </w:r>
+      <w:r>
+        <w:rPr>
+          <w:rFonts w:ascii="Century Gothic" w:hAnsi="Century Gothic"/>
+        </w:rPr>
+        <w:t>firma_paciente</w:t>
+      </w:r>
+      <w:r>
+        <w:rPr>
+          <w:rFonts w:ascii="Century Gothic" w:hAnsi="Century Gothic"/>
+        </w:rPr>
+        <w:t>}}</w:t>
+      </w:r>
+      <w:r>
+        <w:tab/>
+      </w:r>
+      <w:r>
+        <w:tab/>
+      </w:r>
+      <w:r>
+        <w:tab/>
+      </w:r>
+      <w:r>
+        <w:tab/>
+      </w:r>
+      <w:r>
+        <w:tab/>
+      </w:r>
+      <w:r>
+        <w:tab/>
+      </w:r>
+      <w:r>
+        <w:tab/>
+      </w:r>
+      <w:r>
+        <w:tab/>
+      </w:r>
+      <w:r>
+        <w:tab/>
+      </w:r>
+      <w:r>
+        <w:tab/>
       </w:r>
     </w:p>
     <w:sectPr>
       <w:headerReference w:type="default" r:id="rId8"/>
       <w:footerReference w:type="default" r:id="rId9"/>
-      <w:pgSz w:w="11906" w:h="16838"/>
+      <w:pgSz w:w="11906" w:h="16838" w:orient="portrait"/>
       <w:pgMar w:top="1417" w:right="1701" w:bottom="1417" w:left="1701" w:header="708" w:footer="708" w:gutter="0"/>
       <w:cols w:space="708"/>
       <w:docGrid w:linePitch="360"/>
@@ -1874,7 +1963,7 @@
 </file>
 
 <file path=word/footer1.xml><?xml version="1.0" encoding="utf-8"?>
-<w:ftr xmlns:wpc="http://schemas.microsoft.com/office/word/2010/wordprocessingCanvas" xmlns:cx="http://schemas.microsoft.com/office/drawing/2014/chartex" xmlns:cx1="http://schemas.microsoft.com/office/drawing/2015/9/8/chartex" xmlns:cx2="http://schemas.microsoft.com/office/drawing/2015/10/21/chartex" xmlns:cx3="http://schemas.microsoft.com/office/drawing/2016/5/9/chartex" xmlns:cx4="http://schemas.microsoft.com/office/drawing/2016/5/10/chartex" xmlns:cx5="http://schemas.microsoft.com/office/drawing/2016/5/11/chartex" xmlns:cx6="http://schemas.microsoft.com/office/drawing/2016/5/12/chartex" xmlns:cx7="http://schemas.microsoft.com/office/drawing/2016/5/13/chartex" xmlns:cx8="http://schemas.microsoft.com/office/drawing/2016/5/14/chartex" xmlns:mc="http://schemas.openxmlformats.org/markup-compatibility/2006" xmlns:aink="http://schemas.microsoft.com/office/drawing/2016/ink" xmlns:am3d="http://schemas.microsoft.com/office/drawing/2017/model3d" xmlns:o="urn:schemas-microsoft-com:office:office" xmlns:oel="http://schemas.microsoft.com/office/2019/extlst" xmlns:r="http://schemas.openxmlformats.org/officeDocument/2006/relationships" xmlns:m="http://schemas.openxmlformats.org/officeDocument/2006/math" xmlns:v="urn:schemas-microsoft-com:vml" xmlns:wp14="http://schemas.microsoft.com/office/word/2010/wordprocessingDrawing" xmlns:wp="http://schemas.openxmlformats.org/drawingml/2006/wordprocessingDrawing" xmlns:w10="urn:schemas-microsoft-com:office:word" xmlns:w="http://schemas.openxmlformats.org/wordprocessingml/2006/main" xmlns:w14="http://schemas.microsoft.com/office/word/2010/wordml" xmlns:w15="http://schemas.microsoft.com/office/word/2012/wordml" xmlns:w16cex="http://schemas.microsoft.com/office/word/2018/wordml/cex" xmlns:w16cid="http://schemas.microsoft.com/office/word/2016/wordml/cid" xmlns:w16="http://schemas.microsoft.com/office/word/2018/wordml" xmlns:w16du="http://schemas.microsoft.com/office/word/2023/wordml/word16du" xmlns:w16sdtdh="http://schemas.microsoft.com/office/word/2020/wordml/sdtdatahash" xmlns:w16sdtfl="http://schemas.microsoft.com/office/word/2024/wordml/sdtformatlock" xmlns:w16se="http://schemas.microsoft.com/office/word/2015/wordml/symex" xmlns:wpg="http://schemas.microsoft.com/office/word/2010/wordprocessingGroup" xmlns:wpi="http://schemas.microsoft.com/office/word/2010/wordprocessingInk" xmlns:wne="http://schemas.microsoft.com/office/word/2006/wordml" xmlns:wps="http://schemas.microsoft.com/office/word/2010/wordprocessingShape" mc:Ignorable="w14 w15 w16se w16cid w16 w16cex w16sdtdh w16sdtfl w16du wp14">
+<w:ftr xmlns:wpc="http://schemas.microsoft.com/office/word/2010/wordprocessingCanvas" xmlns:cx="http://schemas.microsoft.com/office/drawing/2014/chartex" xmlns:cx1="http://schemas.microsoft.com/office/drawing/2015/9/8/chartex" xmlns:cx2="http://schemas.microsoft.com/office/drawing/2015/10/21/chartex" xmlns:cx3="http://schemas.microsoft.com/office/drawing/2016/5/9/chartex" xmlns:cx4="http://schemas.microsoft.com/office/drawing/2016/5/10/chartex" xmlns:cx5="http://schemas.microsoft.com/office/drawing/2016/5/11/chartex" xmlns:cx6="http://schemas.microsoft.com/office/drawing/2016/5/12/chartex" xmlns:cx7="http://schemas.microsoft.com/office/drawing/2016/5/13/chartex" xmlns:cx8="http://schemas.microsoft.com/office/drawing/2016/5/14/chartex" xmlns:mc="http://schemas.openxmlformats.org/markup-compatibility/2006" xmlns:aink="http://schemas.microsoft.com/office/drawing/2016/ink" xmlns:am3d="http://schemas.microsoft.com/office/drawing/2017/model3d" xmlns:o="urn:schemas-microsoft-com:office:office" xmlns:oel="http://schemas.microsoft.com/office/2019/extlst" xmlns:r="http://schemas.openxmlformats.org/officeDocument/2006/relationships" xmlns:m="http://schemas.openxmlformats.org/officeDocument/2006/math" xmlns:v="urn:schemas-microsoft-com:vml" xmlns:wp14="http://schemas.microsoft.com/office/word/2010/wordprocessingDrawing" xmlns:wp="http://schemas.openxmlformats.org/drawingml/2006/wordprocessingDrawing" xmlns:w10="urn:schemas-microsoft-com:office:word" xmlns:w="http://schemas.openxmlformats.org/wordprocessingml/2006/main" xmlns:w14="http://schemas.microsoft.com/office/word/2010/wordml" xmlns:w15="http://schemas.microsoft.com/office/word/2012/wordml" xmlns:w16cex="http://schemas.microsoft.com/office/word/2018/wordml/cex" xmlns:w16cid="http://schemas.microsoft.com/office/word/2016/wordml/cid" xmlns:w16="http://schemas.microsoft.com/office/word/2018/wordml" xmlns:w16du="http://schemas.microsoft.com/office/word/2023/wordml/word16du" xmlns:w16sdtdh="http://schemas.microsoft.com/office/word/2020/wordml/sdtdatahash" xmlns:w16sdtfl="http://schemas.microsoft.com/office/word/2024/wordml/sdtformatlock" xmlns:w16se="http://schemas.microsoft.com/office/word/2015/wordml/symex" xmlns:wpg="http://schemas.microsoft.com/office/word/2010/wordprocessingGroup" xmlns:wpi="http://schemas.microsoft.com/office/word/2010/wordprocessingInk" xmlns:wne="http://schemas.microsoft.com/office/word/2006/wordml" xmlns:wps="http://schemas.microsoft.com/office/word/2010/wordprocessingShape" xmlns:a="http://schemas.openxmlformats.org/drawingml/2006/main" xmlns:pic="http://schemas.openxmlformats.org/drawingml/2006/picture" xmlns:a14="http://schemas.microsoft.com/office/drawing/2010/main" mc:Ignorable="w14 w15 w16se w16cid w16 w16cex w16sdtdh w16sdtfl w16du wp14">
   <w:p>
     <w:pPr>
       <w:pStyle w:val="Piedepgina"/>
@@ -2012,7 +2101,7 @@
       </w:rPr>
       <w:t xml:space="preserve">Tel: 636554300- Email: </w:t>
     </w:r>
-    <w:hyperlink r:id="rId2" w:history="1">
+    <w:hyperlink w:history="1" r:id="rId2">
       <w:r>
         <w:rPr>
           <w:rStyle w:val="Hipervnculo"/>
@@ -2100,7 +2189,7 @@
 </file>
 
 <file path=word/header1.xml><?xml version="1.0" encoding="utf-8"?>
-<w:hdr xmlns:wpc="http://schemas.microsoft.com/office/word/2010/wordprocessingCanvas" xmlns:cx="http://schemas.microsoft.com/office/drawing/2014/chartex" xmlns:cx1="http://schemas.microsoft.com/office/drawing/2015/9/8/chartex" xmlns:cx2="http://schemas.microsoft.com/office/drawing/2015/10/21/chartex" xmlns:cx3="http://schemas.microsoft.com/office/drawing/2016/5/9/chartex" xmlns:cx4="http://schemas.microsoft.com/office/drawing/2016/5/10/chartex" xmlns:cx5="http://schemas.microsoft.com/office/drawing/2016/5/11/chartex" xmlns:cx6="http://schemas.microsoft.com/office/drawing/2016/5/12/chartex" xmlns:cx7="http://schemas.microsoft.com/office/drawing/2016/5/13/chartex" xmlns:cx8="http://schemas.microsoft.com/office/drawing/2016/5/14/chartex" xmlns:mc="http://schemas.openxmlformats.org/markup-compatibility/2006" xmlns:aink="http://schemas.microsoft.com/office/drawing/2016/ink" xmlns:am3d="http://schemas.microsoft.com/office/drawing/2017/model3d" xmlns:o="urn:schemas-microsoft-com:office:office" xmlns:oel="http://schemas.microsoft.com/office/2019/extlst" xmlns:r="http://schemas.openxmlformats.org/officeDocument/2006/relationships" xmlns:m="http://schemas.openxmlformats.org/officeDocument/2006/math" xmlns:v="urn:schemas-microsoft-com:vml" xmlns:wp14="http://schemas.microsoft.com/office/word/2010/wordprocessingDrawing" xmlns:wp="http://schemas.openxmlformats.org/drawingml/2006/wordprocessingDrawing" xmlns:w10="urn:schemas-microsoft-com:office:word" xmlns:w="http://schemas.openxmlformats.org/wordprocessingml/2006/main" xmlns:w14="http://schemas.microsoft.com/office/word/2010/wordml" xmlns:w15="http://schemas.microsoft.com/office/word/2012/wordml" xmlns:w16cex="http://schemas.microsoft.com/office/word/2018/wordml/cex" xmlns:w16cid="http://schemas.microsoft.com/office/word/2016/wordml/cid" xmlns:w16="http://schemas.microsoft.com/office/word/2018/wordml" xmlns:w16du="http://schemas.microsoft.com/office/word/2023/wordml/word16du" xmlns:w16sdtdh="http://schemas.microsoft.com/office/word/2020/wordml/sdtdatahash" xmlns:w16sdtfl="http://schemas.microsoft.com/office/word/2024/wordml/sdtformatlock" xmlns:w16se="http://schemas.microsoft.com/office/word/2015/wordml/symex" xmlns:wpg="http://schemas.microsoft.com/office/word/2010/wordprocessingGroup" xmlns:wpi="http://schemas.microsoft.com/office/word/2010/wordprocessingInk" xmlns:wne="http://schemas.microsoft.com/office/word/2006/wordml" xmlns:wps="http://schemas.microsoft.com/office/word/2010/wordprocessingShape" mc:Ignorable="w14 w15 w16se w16cid w16 w16cex w16sdtdh w16sdtfl w16du wp14">
+<w:hdr xmlns:wpc="http://schemas.microsoft.com/office/word/2010/wordprocessingCanvas" xmlns:cx="http://schemas.microsoft.com/office/drawing/2014/chartex" xmlns:cx1="http://schemas.microsoft.com/office/drawing/2015/9/8/chartex" xmlns:cx2="http://schemas.microsoft.com/office/drawing/2015/10/21/chartex" xmlns:cx3="http://schemas.microsoft.com/office/drawing/2016/5/9/chartex" xmlns:cx4="http://schemas.microsoft.com/office/drawing/2016/5/10/chartex" xmlns:cx5="http://schemas.microsoft.com/office/drawing/2016/5/11/chartex" xmlns:cx6="http://schemas.microsoft.com/office/drawing/2016/5/12/chartex" xmlns:cx7="http://schemas.microsoft.com/office/drawing/2016/5/13/chartex" xmlns:cx8="http://schemas.microsoft.com/office/drawing/2016/5/14/chartex" xmlns:mc="http://schemas.openxmlformats.org/markup-compatibility/2006" xmlns:aink="http://schemas.microsoft.com/office/drawing/2016/ink" xmlns:am3d="http://schemas.microsoft.com/office/drawing/2017/model3d" xmlns:o="urn:schemas-microsoft-com:office:office" xmlns:oel="http://schemas.microsoft.com/office/2019/extlst" xmlns:r="http://schemas.openxmlformats.org/officeDocument/2006/relationships" xmlns:m="http://schemas.openxmlformats.org/officeDocument/2006/math" xmlns:v="urn:schemas-microsoft-com:vml" xmlns:wp14="http://schemas.microsoft.com/office/word/2010/wordprocessingDrawing" xmlns:wp="http://schemas.openxmlformats.org/drawingml/2006/wordprocessingDrawing" xmlns:w10="urn:schemas-microsoft-com:office:word" xmlns:w="http://schemas.openxmlformats.org/wordprocessingml/2006/main" xmlns:w14="http://schemas.microsoft.com/office/word/2010/wordml" xmlns:w15="http://schemas.microsoft.com/office/word/2012/wordml" xmlns:w16cex="http://schemas.microsoft.com/office/word/2018/wordml/cex" xmlns:w16cid="http://schemas.microsoft.com/office/word/2016/wordml/cid" xmlns:w16="http://schemas.microsoft.com/office/word/2018/wordml" xmlns:w16du="http://schemas.microsoft.com/office/word/2023/wordml/word16du" xmlns:w16sdtdh="http://schemas.microsoft.com/office/word/2020/wordml/sdtdatahash" xmlns:w16sdtfl="http://schemas.microsoft.com/office/word/2024/wordml/sdtformatlock" xmlns:w16se="http://schemas.microsoft.com/office/word/2015/wordml/symex" xmlns:wpg="http://schemas.microsoft.com/office/word/2010/wordprocessingGroup" xmlns:wpi="http://schemas.microsoft.com/office/word/2010/wordprocessingInk" xmlns:wne="http://schemas.microsoft.com/office/word/2006/wordml" xmlns:wps="http://schemas.microsoft.com/office/word/2010/wordprocessingShape" xmlns:a="http://schemas.openxmlformats.org/drawingml/2006/main" xmlns:pic="http://schemas.openxmlformats.org/drawingml/2006/picture" xmlns:a14="http://schemas.microsoft.com/office/drawing/2010/main" mc:Ignorable="w14 w15 w16se w16cid w16 w16cex w16sdtdh w16sdtfl w16du wp14">
   <w:p>
     <w:pPr>
       <w:pStyle w:val="Encabezado"/>
@@ -2186,7 +2275,7 @@
         <w:ind w:left="530" w:hanging="360"/>
       </w:pPr>
       <w:rPr>
-        <w:rFonts w:ascii="Century Gothic" w:eastAsiaTheme="minorHAnsi" w:hAnsi="Century Gothic" w:cstheme="minorBidi" w:hint="default"/>
+        <w:rFonts w:hint="default" w:ascii="Century Gothic" w:hAnsi="Century Gothic" w:eastAsiaTheme="minorHAnsi" w:cstheme="minorBidi"/>
       </w:rPr>
     </w:lvl>
     <w:lvl w:ilvl="1" w:tplc="0C0A0003" w:tentative="1">
@@ -2198,7 +2287,7 @@
         <w:ind w:left="1250" w:hanging="360"/>
       </w:pPr>
       <w:rPr>
-        <w:rFonts w:ascii="Courier New" w:hAnsi="Courier New" w:cs="Courier New" w:hint="default"/>
+        <w:rFonts w:hint="default" w:ascii="Courier New" w:hAnsi="Courier New" w:cs="Courier New"/>
       </w:rPr>
     </w:lvl>
     <w:lvl w:ilvl="2" w:tplc="0C0A0005" w:tentative="1">
@@ -2210,7 +2299,7 @@
         <w:ind w:left="1970" w:hanging="360"/>
       </w:pPr>
       <w:rPr>
-        <w:rFonts w:ascii="Wingdings" w:hAnsi="Wingdings" w:hint="default"/>
+        <w:rFonts w:hint="default" w:ascii="Wingdings" w:hAnsi="Wingdings"/>
       </w:rPr>
     </w:lvl>
     <w:lvl w:ilvl="3" w:tplc="0C0A0001" w:tentative="1">
@@ -2222,7 +2311,7 @@
         <w:ind w:left="2690" w:hanging="360"/>
       </w:pPr>
       <w:rPr>
-        <w:rFonts w:ascii="Symbol" w:hAnsi="Symbol" w:hint="default"/>
+        <w:rFonts w:hint="default" w:ascii="Symbol" w:hAnsi="Symbol"/>
       </w:rPr>
     </w:lvl>
     <w:lvl w:ilvl="4" w:tplc="0C0A0003" w:tentative="1">
@@ -2234,7 +2323,7 @@
         <w:ind w:left="3410" w:hanging="360"/>
       </w:pPr>
       <w:rPr>
-        <w:rFonts w:ascii="Courier New" w:hAnsi="Courier New" w:cs="Courier New" w:hint="default"/>
+        <w:rFonts w:hint="default" w:ascii="Courier New" w:hAnsi="Courier New" w:cs="Courier New"/>
       </w:rPr>
     </w:lvl>
     <w:lvl w:ilvl="5" w:tplc="0C0A0005" w:tentative="1">
@@ -2246,7 +2335,7 @@
         <w:ind w:left="4130" w:hanging="360"/>
       </w:pPr>
       <w:rPr>
-        <w:rFonts w:ascii="Wingdings" w:hAnsi="Wingdings" w:hint="default"/>
+        <w:rFonts w:hint="default" w:ascii="Wingdings" w:hAnsi="Wingdings"/>
       </w:rPr>
     </w:lvl>
     <w:lvl w:ilvl="6" w:tplc="0C0A0001" w:tentative="1">
@@ -2258,7 +2347,7 @@
         <w:ind w:left="4850" w:hanging="360"/>
       </w:pPr>
       <w:rPr>
-        <w:rFonts w:ascii="Symbol" w:hAnsi="Symbol" w:hint="default"/>
+        <w:rFonts w:hint="default" w:ascii="Symbol" w:hAnsi="Symbol"/>
       </w:rPr>
     </w:lvl>
     <w:lvl w:ilvl="7" w:tplc="0C0A0003" w:tentative="1">
@@ -2270,7 +2359,7 @@
         <w:ind w:left="5570" w:hanging="360"/>
       </w:pPr>
       <w:rPr>
-        <w:rFonts w:ascii="Courier New" w:hAnsi="Courier New" w:cs="Courier New" w:hint="default"/>
+        <w:rFonts w:hint="default" w:ascii="Courier New" w:hAnsi="Courier New" w:cs="Courier New"/>
       </w:rPr>
     </w:lvl>
     <w:lvl w:ilvl="8" w:tplc="0C0A0005" w:tentative="1">
@@ -2282,7 +2371,7 @@
         <w:ind w:left="6290" w:hanging="360"/>
       </w:pPr>
       <w:rPr>
-        <w:rFonts w:ascii="Wingdings" w:hAnsi="Wingdings" w:hint="default"/>
+        <w:rFonts w:hint="default" w:ascii="Wingdings" w:hAnsi="Wingdings"/>
       </w:rPr>
     </w:lvl>
   </w:abstractNum>
@@ -2293,11 +2382,11 @@
 </file>
 
 <file path=word/styles.xml><?xml version="1.0" encoding="utf-8"?>
-<w:styles xmlns:mc="http://schemas.openxmlformats.org/markup-compatibility/2006" xmlns:r="http://schemas.openxmlformats.org/officeDocument/2006/relationships" xmlns:w="http://schemas.openxmlformats.org/wordprocessingml/2006/main" xmlns:w14="http://schemas.microsoft.com/office/word/2010/wordml" xmlns:w15="http://schemas.microsoft.com/office/word/2012/wordml" xmlns:w16cex="http://schemas.microsoft.com/office/word/2018/wordml/cex" xmlns:w16cid="http://schemas.microsoft.com/office/word/2016/wordml/cid" xmlns:w16="http://schemas.microsoft.com/office/word/2018/wordml" xmlns:w16du="http://schemas.microsoft.com/office/word/2023/wordml/word16du" xmlns:w16sdtdh="http://schemas.microsoft.com/office/word/2020/wordml/sdtdatahash" xmlns:w16sdtfl="http://schemas.microsoft.com/office/word/2024/wordml/sdtformatlock" xmlns:w16se="http://schemas.microsoft.com/office/word/2015/wordml/symex" mc:Ignorable="w14 w15 w16se w16cid w16 w16cex w16sdtdh w16sdtfl w16du">
+<w:styles xmlns:wp14="http://schemas.microsoft.com/office/word/2010/wordprocessingDrawing" xmlns:mc="http://schemas.openxmlformats.org/markup-compatibility/2006" xmlns:r="http://schemas.openxmlformats.org/officeDocument/2006/relationships" xmlns:w="http://schemas.openxmlformats.org/wordprocessingml/2006/main" xmlns:w14="http://schemas.microsoft.com/office/word/2010/wordml" xmlns:w15="http://schemas.microsoft.com/office/word/2012/wordml" xmlns:w16cex="http://schemas.microsoft.com/office/word/2018/wordml/cex" xmlns:w16cid="http://schemas.microsoft.com/office/word/2016/wordml/cid" xmlns:w16="http://schemas.microsoft.com/office/word/2018/wordml" xmlns:w16du="http://schemas.microsoft.com/office/word/2023/wordml/word16du" xmlns:w16sdtdh="http://schemas.microsoft.com/office/word/2020/wordml/sdtdatahash" xmlns:w16sdtfl="http://schemas.microsoft.com/office/word/2024/wordml/sdtformatlock" xmlns:w16se="http://schemas.microsoft.com/office/word/2015/wordml/symex" mc:Ignorable="w14 w15 w16se w16cid w16 w16cex w16sdtdh w16sdtfl w16du wp14">
   <w:docDefaults>
     <w:rPrDefault>
       <w:rPr>
-        <w:rFonts w:asciiTheme="minorHAnsi" w:eastAsiaTheme="minorHAnsi" w:hAnsiTheme="minorHAnsi" w:cstheme="minorBidi"/>
+        <w:rFonts w:asciiTheme="minorHAnsi" w:hAnsiTheme="minorHAnsi" w:eastAsiaTheme="minorHAnsi" w:cstheme="minorBidi"/>
         <w:sz w:val="22"/>
         <w:szCs w:val="22"/>
         <w:lang w:val="es-ES" w:eastAsia="en-US" w:bidi="ar-SA"/>
@@ -2313,14 +2402,14 @@
   <w:latentStyles w:defLockedState="0" w:defUIPriority="99" w:defSemiHidden="0" w:defUnhideWhenUsed="0" w:defQFormat="0" w:count="376">
     <w:lsdException w:name="Normal" w:uiPriority="0" w:qFormat="1"/>
     <w:lsdException w:name="heading 1" w:uiPriority="9" w:qFormat="1"/>
-    <w:lsdException w:name="heading 2" w:semiHidden="1" w:uiPriority="9" w:unhideWhenUsed="1" w:qFormat="1"/>
-    <w:lsdException w:name="heading 3" w:semiHidden="1" w:uiPriority="9" w:unhideWhenUsed="1" w:qFormat="1"/>
-    <w:lsdException w:name="heading 4" w:semiHidden="1" w:uiPriority="9" w:unhideWhenUsed="1" w:qFormat="1"/>
-    <w:lsdException w:name="heading 5" w:semiHidden="1" w:uiPriority="9" w:unhideWhenUsed="1" w:qFormat="1"/>
-    <w:lsdException w:name="heading 6" w:semiHidden="1" w:uiPriority="9" w:unhideWhenUsed="1" w:qFormat="1"/>
-    <w:lsdException w:name="heading 7" w:semiHidden="1" w:uiPriority="9" w:unhideWhenUsed="1" w:qFormat="1"/>
-    <w:lsdException w:name="heading 8" w:semiHidden="1" w:uiPriority="9" w:unhideWhenUsed="1" w:qFormat="1"/>
-    <w:lsdException w:name="heading 9" w:semiHidden="1" w:uiPriority="9" w:unhideWhenUsed="1" w:qFormat="1"/>
+    <w:lsdException w:name="heading 2" w:uiPriority="9" w:semiHidden="1" w:unhideWhenUsed="1" w:qFormat="1"/>
+    <w:lsdException w:name="heading 3" w:uiPriority="9" w:semiHidden="1" w:unhideWhenUsed="1" w:qFormat="1"/>
+    <w:lsdException w:name="heading 4" w:uiPriority="9" w:semiHidden="1" w:unhideWhenUsed="1" w:qFormat="1"/>
+    <w:lsdException w:name="heading 5" w:uiPriority="9" w:semiHidden="1" w:unhideWhenUsed="1" w:qFormat="1"/>
+    <w:lsdException w:name="heading 6" w:uiPriority="9" w:semiHidden="1" w:unhideWhenUsed="1" w:qFormat="1"/>
+    <w:lsdException w:name="heading 7" w:uiPriority="9" w:semiHidden="1" w:unhideWhenUsed="1" w:qFormat="1"/>
+    <w:lsdException w:name="heading 8" w:uiPriority="9" w:semiHidden="1" w:unhideWhenUsed="1" w:qFormat="1"/>
+    <w:lsdException w:name="heading 9" w:uiPriority="9" w:semiHidden="1" w:unhideWhenUsed="1" w:qFormat="1"/>
     <w:lsdException w:name="index 1" w:semiHidden="1" w:unhideWhenUsed="1"/>
     <w:lsdException w:name="index 2" w:semiHidden="1" w:unhideWhenUsed="1"/>
     <w:lsdException w:name="index 3" w:semiHidden="1" w:unhideWhenUsed="1"/>
@@ -2330,22 +2419,22 @@
     <w:lsdException w:name="index 7" w:semiHidden="1" w:unhideWhenUsed="1"/>
     <w:lsdException w:name="index 8" w:semiHidden="1" w:unhideWhenUsed="1"/>
     <w:lsdException w:name="index 9" w:semiHidden="1" w:unhideWhenUsed="1"/>
-    <w:lsdException w:name="toc 1" w:semiHidden="1" w:uiPriority="39" w:unhideWhenUsed="1"/>
-    <w:lsdException w:name="toc 2" w:semiHidden="1" w:uiPriority="39" w:unhideWhenUsed="1"/>
-    <w:lsdException w:name="toc 3" w:semiHidden="1" w:uiPriority="39" w:unhideWhenUsed="1"/>
-    <w:lsdException w:name="toc 4" w:semiHidden="1" w:uiPriority="39" w:unhideWhenUsed="1"/>
-    <w:lsdException w:name="toc 5" w:semiHidden="1" w:uiPriority="39" w:unhideWhenUsed="1"/>
-    <w:lsdException w:name="toc 6" w:semiHidden="1" w:uiPriority="39" w:unhideWhenUsed="1"/>
-    <w:lsdException w:name="toc 7" w:semiHidden="1" w:uiPriority="39" w:unhideWhenUsed="1"/>
-    <w:lsdException w:name="toc 8" w:semiHidden="1" w:uiPriority="39" w:unhideWhenUsed="1"/>
-    <w:lsdException w:name="toc 9" w:semiHidden="1" w:uiPriority="39" w:unhideWhenUsed="1"/>
+    <w:lsdException w:name="toc 1" w:uiPriority="39" w:semiHidden="1" w:unhideWhenUsed="1"/>
+    <w:lsdException w:name="toc 2" w:uiPriority="39" w:semiHidden="1" w:unhideWhenUsed="1"/>
+    <w:lsdException w:name="toc 3" w:uiPriority="39" w:semiHidden="1" w:unhideWhenUsed="1"/>
+    <w:lsdException w:name="toc 4" w:uiPriority="39" w:semiHidden="1" w:unhideWhenUsed="1"/>
+    <w:lsdException w:name="toc 5" w:uiPriority="39" w:semiHidden="1" w:unhideWhenUsed="1"/>
+    <w:lsdException w:name="toc 6" w:uiPriority="39" w:semiHidden="1" w:unhideWhenUsed="1"/>
+    <w:lsdException w:name="toc 7" w:uiPriority="39" w:semiHidden="1" w:unhideWhenUsed="1"/>
+    <w:lsdException w:name="toc 8" w:uiPriority="39" w:semiHidden="1" w:unhideWhenUsed="1"/>
+    <w:lsdException w:name="toc 9" w:uiPriority="39" w:semiHidden="1" w:unhideWhenUsed="1"/>
     <w:lsdException w:name="Normal Indent" w:semiHidden="1" w:unhideWhenUsed="1"/>
     <w:lsdException w:name="footnote text" w:semiHidden="1" w:unhideWhenUsed="1"/>
     <w:lsdException w:name="annotation text" w:semiHidden="1" w:unhideWhenUsed="1"/>
     <w:lsdException w:name="header" w:semiHidden="1" w:unhideWhenUsed="1"/>
     <w:lsdException w:name="footer" w:semiHidden="1" w:unhideWhenUsed="1"/>
     <w:lsdException w:name="index heading" w:semiHidden="1" w:unhideWhenUsed="1"/>
-    <w:lsdException w:name="caption" w:semiHidden="1" w:uiPriority="35" w:unhideWhenUsed="1" w:qFormat="1"/>
+    <w:lsdException w:name="caption" w:uiPriority="35" w:semiHidden="1" w:unhideWhenUsed="1" w:qFormat="1"/>
     <w:lsdException w:name="table of figures" w:semiHidden="1" w:unhideWhenUsed="1"/>
     <w:lsdException w:name="envelope address" w:semiHidden="1" w:unhideWhenUsed="1"/>
     <w:lsdException w:name="envelope return" w:semiHidden="1" w:unhideWhenUsed="1"/>
@@ -2376,7 +2465,7 @@
     <w:lsdException w:name="Title" w:uiPriority="10" w:qFormat="1"/>
     <w:lsdException w:name="Closing" w:semiHidden="1" w:unhideWhenUsed="1"/>
     <w:lsdException w:name="Signature" w:semiHidden="1" w:unhideWhenUsed="1"/>
-    <w:lsdException w:name="Default Paragraph Font" w:semiHidden="1" w:uiPriority="1" w:unhideWhenUsed="1"/>
+    <w:lsdException w:name="Default Paragraph Font" w:uiPriority="1" w:semiHidden="1" w:unhideWhenUsed="1"/>
     <w:lsdException w:name="Body Text" w:semiHidden="1" w:unhideWhenUsed="1"/>
     <w:lsdException w:name="Body Text Indent" w:semiHidden="1" w:unhideWhenUsed="1"/>
     <w:lsdException w:name="List Continue" w:semiHidden="1" w:unhideWhenUsed="1"/>
@@ -2576,8 +2665,8 @@
     <w:lsdException w:name="Subtle Reference" w:uiPriority="31" w:qFormat="1"/>
     <w:lsdException w:name="Intense Reference" w:uiPriority="32" w:qFormat="1"/>
     <w:lsdException w:name="Book Title" w:uiPriority="33" w:qFormat="1"/>
-    <w:lsdException w:name="Bibliography" w:semiHidden="1" w:uiPriority="37" w:unhideWhenUsed="1"/>
-    <w:lsdException w:name="TOC Heading" w:semiHidden="1" w:uiPriority="39" w:unhideWhenUsed="1" w:qFormat="1"/>
+    <w:lsdException w:name="Bibliography" w:uiPriority="37" w:semiHidden="1" w:unhideWhenUsed="1"/>
+    <w:lsdException w:name="TOC Heading" w:uiPriority="39" w:semiHidden="1" w:unhideWhenUsed="1" w:qFormat="1"/>
     <w:lsdException w:name="Plain Table 1" w:uiPriority="41"/>
     <w:lsdException w:name="Plain Table 2" w:uiPriority="42"/>
     <w:lsdException w:name="Plain Table 3" w:uiPriority="43"/>
@@ -2688,17 +2777,17 @@
     <w:lsdException w:name="Unresolved Mention" w:semiHidden="1" w:unhideWhenUsed="1"/>
     <w:lsdException w:name="Smart Link" w:semiHidden="1" w:unhideWhenUsed="1"/>
   </w:latentStyles>
-  <w:style w:type="paragraph" w:default="1" w:styleId="Normal">
+  <w:style w:type="paragraph" w:styleId="Normal" w:default="1">
     <w:name w:val="Normal"/>
     <w:qFormat/>
   </w:style>
-  <w:style w:type="character" w:default="1" w:styleId="Fuentedeprrafopredeter">
+  <w:style w:type="character" w:styleId="Fuentedeprrafopredeter" w:default="1">
     <w:name w:val="Default Paragraph Font"/>
     <w:uiPriority w:val="1"/>
     <w:semiHidden/>
     <w:unhideWhenUsed/>
   </w:style>
-  <w:style w:type="table" w:default="1" w:styleId="Tablanormal">
+  <w:style w:type="table" w:styleId="Tablanormal" w:default="1">
     <w:name w:val="Normal Table"/>
     <w:uiPriority w:val="99"/>
     <w:semiHidden/>
@@ -2713,7 +2802,7 @@
       </w:tblCellMar>
     </w:tblPr>
   </w:style>
-  <w:style w:type="numbering" w:default="1" w:styleId="Sinlista">
+  <w:style w:type="numbering" w:styleId="Sinlista" w:default="1">
     <w:name w:val="No List"/>
     <w:uiPriority w:val="99"/>
     <w:semiHidden/>
@@ -2745,7 +2834,7 @@
       <w:spacing w:after="0"/>
     </w:pPr>
   </w:style>
-  <w:style w:type="character" w:customStyle="1" w:styleId="EncabezadoCar">
+  <w:style w:type="character" w:styleId="EncabezadoCar" w:customStyle="1">
     <w:name w:val="Encabezado Car"/>
     <w:basedOn w:val="Fuentedeprrafopredeter"/>
     <w:link w:val="Encabezado"/>
@@ -2767,7 +2856,7 @@
       <w:spacing w:after="0"/>
     </w:pPr>
   </w:style>
-  <w:style w:type="character" w:customStyle="1" w:styleId="PiedepginaCar">
+  <w:style w:type="character" w:styleId="PiedepginaCar" w:customStyle="1">
     <w:name w:val="Pie de página Car"/>
     <w:basedOn w:val="Fuentedeprrafopredeter"/>
     <w:link w:val="Piedepgina"/>
@@ -2813,7 +2902,7 @@
 </file>
 
 <file path=word/theme/theme1.xml><?xml version="1.0" encoding="utf-8"?>
-<a:theme xmlns:a="http://schemas.openxmlformats.org/drawingml/2006/main" name="Tema de Office">
+<a:theme xmlns:a="http://schemas.openxmlformats.org/drawingml/2006/main" xmlns:thm15="http://schemas.microsoft.com/office/thememl/2012/main" name="Tema de Office">
   <a:themeElements>
     <a:clrScheme name="Office">
       <a:dk1>

</xml_diff>

<commit_message>
cambios en los espacios de las firmas
</commit_message>
<xml_diff>
--- a/app/static/docs/CI FISIOTERAPIA GENERAL.docx
+++ b/app/static/docs/CI FISIOTERAPIA GENERAL.docx
@@ -297,43 +297,7 @@
           <w:sz w:val="24"/>
           <w:szCs w:val="24"/>
         </w:rPr>
-        <w:t>tratamiento de determinadas patologías mediante la electricidad o radiaciones electromagnéticas (</w:t>
-      </w:r>
-      <w:proofErr w:type="spellStart"/>
-      <w:r>
-        <w:rPr>
-          <w:rFonts w:ascii="Century Gothic" w:hAnsi="Century Gothic"/>
-          <w:sz w:val="24"/>
-          <w:szCs w:val="24"/>
-        </w:rPr>
-        <w:t>espectroterapia</w:t>
-      </w:r>
-      <w:proofErr w:type="spellEnd"/>
-      <w:r>
-        <w:rPr>
-          <w:rFonts w:ascii="Century Gothic" w:hAnsi="Century Gothic"/>
-          <w:sz w:val="24"/>
-          <w:szCs w:val="24"/>
-        </w:rPr>
-        <w:t xml:space="preserve">) aplicadas sobre el organismo para mejorar el estado de los tejidos (efecto trófico), aliviar el dolor (efecto analgésico) y ayudar a la recuperación motora (efecto </w:t>
-      </w:r>
-      <w:proofErr w:type="spellStart"/>
-      <w:r>
-        <w:rPr>
-          <w:rFonts w:ascii="Century Gothic" w:hAnsi="Century Gothic"/>
-          <w:sz w:val="24"/>
-          <w:szCs w:val="24"/>
-        </w:rPr>
-        <w:t>excitomotor</w:t>
-      </w:r>
-      <w:proofErr w:type="spellEnd"/>
-      <w:r>
-        <w:rPr>
-          <w:rFonts w:ascii="Century Gothic" w:hAnsi="Century Gothic"/>
-          <w:sz w:val="24"/>
-          <w:szCs w:val="24"/>
-        </w:rPr>
-        <w:t>)</w:t>
+        <w:t>tratamiento de determinadas patologías mediante la electricidad o radiaciones electromagnéticas (espectroterapia) aplicadas sobre el organismo para mejorar el estado de los tejidos (efecto trófico), aliviar el dolor (efecto analgésico) y ayudar a la recuperación motora (efecto excitomotor)</w:t>
       </w:r>
     </w:p>
     <w:p>
@@ -770,16 +734,8 @@
         <w:rPr>
           <w:rFonts w:ascii="Century Gothic" w:hAnsi="Century Gothic"/>
         </w:rPr>
-        <w:t xml:space="preserve">Epilépticos no controlados y síndromes </w:t>
-      </w:r>
-      <w:proofErr w:type="spellStart"/>
-      <w:r>
-        <w:rPr>
-          <w:rFonts w:ascii="Century Gothic" w:hAnsi="Century Gothic"/>
-        </w:rPr>
-        <w:t>coréicos</w:t>
-      </w:r>
-      <w:proofErr w:type="spellEnd"/>
+        <w:t>Epilépticos no controlados y síndromes coréicos</w:t>
+      </w:r>
     </w:p>
     <w:p>
       <w:pPr>
@@ -1072,17 +1028,8 @@
           <w:rFonts w:ascii="Century Gothic" w:hAnsi="Century Gothic"/>
           <w:b/>
         </w:rPr>
-        <w:t>Paciente: D/</w:t>
-      </w:r>
-      <w:proofErr w:type="spellStart"/>
-      <w:r>
-        <w:rPr>
-          <w:rFonts w:ascii="Century Gothic" w:hAnsi="Century Gothic"/>
-          <w:b/>
-        </w:rPr>
-        <w:t>Dña</w:t>
-      </w:r>
-      <w:proofErr w:type="spellEnd"/>
+        <w:t>Paciente: D/Dña</w:t>
+      </w:r>
       <w:r>
         <w:rPr>
           <w:rFonts w:ascii="Century Gothic" w:hAnsi="Century Gothic"/>
@@ -1095,23 +1042,7 @@
           <w:rFonts w:ascii="Century Gothic" w:hAnsi="Century Gothic"/>
           <w:b/>
         </w:rPr>
-        <w:t>{{</w:t>
-      </w:r>
-      <w:proofErr w:type="spellStart"/>
-      <w:r>
-        <w:rPr>
-          <w:rFonts w:ascii="Century Gothic" w:hAnsi="Century Gothic"/>
-          <w:b/>
-        </w:rPr>
-        <w:t>nombre_paciente</w:t>
-      </w:r>
-      <w:proofErr w:type="spellEnd"/>
-      <w:r>
-        <w:rPr>
-          <w:rFonts w:ascii="Century Gothic" w:hAnsi="Century Gothic"/>
-          <w:b/>
-        </w:rPr>
-        <w:t>}}</w:t>
+        <w:t>{{nombre_paciente}}</w:t>
       </w:r>
       <w:r>
         <w:rPr>
@@ -1139,23 +1070,7 @@
           <w:rFonts w:ascii="Century Gothic" w:hAnsi="Century Gothic"/>
           <w:b/>
         </w:rPr>
-        <w:t>{{</w:t>
-      </w:r>
-      <w:proofErr w:type="spellStart"/>
-      <w:r>
-        <w:rPr>
-          <w:rFonts w:ascii="Century Gothic" w:hAnsi="Century Gothic"/>
-          <w:b/>
-        </w:rPr>
-        <w:t>dni_paciente</w:t>
-      </w:r>
-      <w:proofErr w:type="spellEnd"/>
-      <w:r>
-        <w:rPr>
-          <w:rFonts w:ascii="Century Gothic" w:hAnsi="Century Gothic"/>
-          <w:b/>
-        </w:rPr>
-        <w:t>}}</w:t>
+        <w:t>{{dni_paciente}}</w:t>
       </w:r>
     </w:p>
     <w:p>
@@ -1224,14 +1139,7 @@
         <w:rPr>
           <w:rFonts w:ascii="Century Gothic" w:hAnsi="Century Gothic"/>
         </w:rPr>
-        <w:t>{{</w:t>
-      </w:r>
-      <w:proofErr w:type="spellStart"/>
-      <w:r>
-        <w:rPr>
-          <w:rFonts w:ascii="Century Gothic" w:hAnsi="Century Gothic"/>
-        </w:rPr>
-        <w:t>d</w:t>
+        <w:t>{{d</w:t>
       </w:r>
       <w:r>
         <w:rPr>
@@ -1243,14 +1151,7 @@
         <w:rPr>
           <w:rFonts w:ascii="Century Gothic" w:hAnsi="Century Gothic"/>
         </w:rPr>
-        <w:t>a_firma</w:t>
-      </w:r>
-      <w:proofErr w:type="spellEnd"/>
-      <w:r>
-        <w:rPr>
-          <w:rFonts w:ascii="Century Gothic" w:hAnsi="Century Gothic"/>
-        </w:rPr>
-        <w:t>}}</w:t>
+        <w:t>a_firma}}</w:t>
       </w:r>
       <w:r>
         <w:rPr>
@@ -1262,21 +1163,7 @@
         <w:rPr>
           <w:rFonts w:ascii="Century Gothic" w:hAnsi="Century Gothic"/>
         </w:rPr>
-        <w:t xml:space="preserve"> {{</w:t>
-      </w:r>
-      <w:proofErr w:type="spellStart"/>
-      <w:r>
-        <w:rPr>
-          <w:rFonts w:ascii="Century Gothic" w:hAnsi="Century Gothic"/>
-        </w:rPr>
-        <w:t>mes_firma</w:t>
-      </w:r>
-      <w:proofErr w:type="spellEnd"/>
-      <w:r>
-        <w:rPr>
-          <w:rFonts w:ascii="Century Gothic" w:hAnsi="Century Gothic"/>
-        </w:rPr>
-        <w:t>}}</w:t>
+        <w:t xml:space="preserve"> {{mes_firma}}</w:t>
       </w:r>
       <w:r>
         <w:rPr>
@@ -1288,21 +1175,7 @@
         <w:rPr>
           <w:rFonts w:ascii="Century Gothic" w:hAnsi="Century Gothic"/>
         </w:rPr>
-        <w:t>{{</w:t>
-      </w:r>
-      <w:proofErr w:type="spellStart"/>
-      <w:r>
-        <w:rPr>
-          <w:rFonts w:ascii="Century Gothic" w:hAnsi="Century Gothic"/>
-        </w:rPr>
-        <w:t>ano_firma</w:t>
-      </w:r>
-      <w:proofErr w:type="spellEnd"/>
-      <w:r>
-        <w:rPr>
-          <w:rFonts w:ascii="Century Gothic" w:hAnsi="Century Gothic"/>
-        </w:rPr>
-        <w:t>}}</w:t>
+        <w:t>{{ano_firma}}</w:t>
       </w:r>
     </w:p>
     <w:p>
@@ -1328,46 +1201,14 @@
           <w:rFonts w:ascii="Century Gothic" w:hAnsi="Century Gothic"/>
           <w:b/>
         </w:rPr>
-        <w:t>Fisioterapeuta: D/</w:t>
-      </w:r>
-      <w:proofErr w:type="spellStart"/>
-      <w:r>
-        <w:rPr>
-          <w:rFonts w:ascii="Century Gothic" w:hAnsi="Century Gothic"/>
-          <w:b/>
-        </w:rPr>
-        <w:t>Dña</w:t>
-      </w:r>
-      <w:proofErr w:type="spellEnd"/>
-      <w:r>
-        <w:rPr>
-          <w:rFonts w:ascii="Century Gothic" w:hAnsi="Century Gothic"/>
-          <w:b/>
-        </w:rPr>
-        <w:t xml:space="preserve">: </w:t>
-      </w:r>
-      <w:r>
-        <w:rPr>
-          <w:rFonts w:ascii="Century Gothic" w:hAnsi="Century Gothic"/>
-          <w:b/>
-        </w:rPr>
-        <w:t>{{</w:t>
-      </w:r>
-      <w:proofErr w:type="spellStart"/>
-      <w:r>
-        <w:rPr>
-          <w:rFonts w:ascii="Century Gothic" w:hAnsi="Century Gothic"/>
-          <w:b/>
-        </w:rPr>
-        <w:t>fisio_firma</w:t>
-      </w:r>
-      <w:proofErr w:type="spellEnd"/>
-      <w:r>
-        <w:rPr>
-          <w:rFonts w:ascii="Century Gothic" w:hAnsi="Century Gothic"/>
-          <w:b/>
-        </w:rPr>
-        <w:t>}}</w:t>
+        <w:t xml:space="preserve">Fisioterapeuta: D/Dña: </w:t>
+      </w:r>
+      <w:r>
+        <w:rPr>
+          <w:rFonts w:ascii="Century Gothic" w:hAnsi="Century Gothic"/>
+          <w:b/>
+        </w:rPr>
+        <w:t>{{fisio_firma}}</w:t>
       </w:r>
       <w:r>
         <w:rPr>
@@ -1395,23 +1236,7 @@
           <w:rFonts w:ascii="Century Gothic" w:hAnsi="Century Gothic"/>
           <w:b/>
         </w:rPr>
-        <w:t>{{</w:t>
-      </w:r>
-      <w:proofErr w:type="spellStart"/>
-      <w:r>
-        <w:rPr>
-          <w:rFonts w:ascii="Century Gothic" w:hAnsi="Century Gothic"/>
-          <w:b/>
-        </w:rPr>
-        <w:t>dni_fisio_firma</w:t>
-      </w:r>
-      <w:proofErr w:type="spellEnd"/>
-      <w:r>
-        <w:rPr>
-          <w:rFonts w:ascii="Century Gothic" w:hAnsi="Century Gothic"/>
-          <w:b/>
-        </w:rPr>
-        <w:t>}}</w:t>
+        <w:t>{{dni_fisio_firma}}</w:t>
       </w:r>
     </w:p>
     <w:p>
@@ -1432,21 +1257,7 @@
         <w:rPr>
           <w:rFonts w:ascii="Century Gothic" w:hAnsi="Century Gothic"/>
         </w:rPr>
-        <w:t>{{</w:t>
-      </w:r>
-      <w:proofErr w:type="spellStart"/>
-      <w:r>
-        <w:rPr>
-          <w:rFonts w:ascii="Century Gothic" w:hAnsi="Century Gothic"/>
-        </w:rPr>
-        <w:t>ud_fisioterapia</w:t>
-      </w:r>
-      <w:proofErr w:type="spellEnd"/>
-      <w:r>
-        <w:rPr>
-          <w:rFonts w:ascii="Century Gothic" w:hAnsi="Century Gothic"/>
-        </w:rPr>
-        <w:t>}}</w:t>
+        <w:t>{{ud_fisioterapia}}</w:t>
       </w:r>
       <w:r>
         <w:rPr>
@@ -1489,14 +1300,7 @@
         <w:rPr>
           <w:rFonts w:ascii="Century Gothic" w:hAnsi="Century Gothic"/>
         </w:rPr>
-        <w:t>En Valverde del Camino, a {{</w:t>
-      </w:r>
-      <w:proofErr w:type="spellStart"/>
-      <w:r>
-        <w:rPr>
-          <w:rFonts w:ascii="Century Gothic" w:hAnsi="Century Gothic"/>
-        </w:rPr>
-        <w:t>d</w:t>
+        <w:t>En Valverde del Camino, a {{d</w:t>
       </w:r>
       <w:r>
         <w:rPr>
@@ -1508,37 +1312,250 @@
         <w:rPr>
           <w:rFonts w:ascii="Century Gothic" w:hAnsi="Century Gothic"/>
         </w:rPr>
+        <w:t>a_firma}} de {{mes_firma}} de {{ano_firma}}</w:t>
+      </w:r>
+    </w:p>
+    <w:p>
+      <w:pPr>
+        <w:ind w:left="170" w:firstLine="0"/>
+        <w:jc w:val="both"/>
+        <w:rPr>
+          <w:rFonts w:ascii="Century Gothic" w:hAnsi="Century Gothic"/>
+        </w:rPr>
+      </w:pPr>
+    </w:p>
+    <w:p>
+      <w:pPr>
+        <w:ind w:left="170" w:firstLine="0"/>
+        <w:jc w:val="both"/>
+        <w:rPr>
+          <w:rFonts w:ascii="Century Gothic" w:hAnsi="Century Gothic"/>
+          <w:b/>
+        </w:rPr>
+      </w:pPr>
+      <w:r>
+        <w:rPr>
+          <w:rFonts w:ascii="Century Gothic" w:hAnsi="Century Gothic"/>
+          <w:b/>
+        </w:rPr>
+        <w:t>Autorización de familiar o tutor</w:t>
+      </w:r>
+    </w:p>
+    <w:p>
+      <w:pPr>
+        <w:ind w:left="170" w:firstLine="0"/>
+        <w:jc w:val="both"/>
+        <w:rPr>
+          <w:rFonts w:ascii="Century Gothic" w:hAnsi="Century Gothic"/>
+        </w:rPr>
+      </w:pPr>
+      <w:r>
+        <w:rPr>
+          <w:rFonts w:ascii="Century Gothic" w:hAnsi="Century Gothic"/>
+        </w:rPr>
+        <w:t xml:space="preserve">Ante la imposibilidad de D/Dña </w:t>
+      </w:r>
+      <w:r>
+        <w:rPr>
+          <w:rFonts w:ascii="Century Gothic" w:hAnsi="Century Gothic"/>
+        </w:rPr>
+        <w:t>{{nombre_paciente_rep}}</w:t>
+      </w:r>
+      <w:r>
+        <w:rPr>
+          <w:rFonts w:ascii="Century Gothic" w:hAnsi="Century Gothic"/>
+        </w:rPr>
+        <w:t xml:space="preserve"> con DNI</w:t>
+      </w:r>
+      <w:r>
+        <w:rPr>
+          <w:rFonts w:ascii="Century Gothic" w:hAnsi="Century Gothic"/>
+        </w:rPr>
+        <w:t xml:space="preserve"> </w:t>
+      </w:r>
+      <w:r>
+        <w:rPr>
+          <w:rFonts w:ascii="Century Gothic" w:hAnsi="Century Gothic"/>
+        </w:rPr>
+        <w:t>{{dni_paciente_rep}}</w:t>
+      </w:r>
+      <w:r>
+        <w:rPr>
+          <w:rFonts w:ascii="Century Gothic" w:hAnsi="Century Gothic"/>
+        </w:rPr>
+        <w:t xml:space="preserve"> de prestar autorización para los tratamientos expuestos en el presente documento de forma libre, voluntaria y consciente:</w:t>
+      </w:r>
+    </w:p>
+    <w:p>
+      <w:pPr>
+        <w:ind w:left="170" w:firstLine="0"/>
+        <w:jc w:val="both"/>
+        <w:rPr>
+          <w:rFonts w:ascii="Century Gothic" w:hAnsi="Century Gothic"/>
+        </w:rPr>
+      </w:pPr>
+      <w:r>
+        <w:rPr>
+          <w:rFonts w:ascii="Century Gothic" w:hAnsi="Century Gothic"/>
+        </w:rPr>
+        <w:t xml:space="preserve">D/Dña </w:t>
+      </w:r>
+      <w:r>
+        <w:rPr>
+          <w:rFonts w:ascii="Century Gothic" w:hAnsi="Century Gothic"/>
+        </w:rPr>
+        <w:t>{{nombre_</w:t>
+      </w:r>
+      <w:r>
+        <w:rPr>
+          <w:rFonts w:ascii="Century Gothic" w:hAnsi="Century Gothic"/>
+        </w:rPr>
+        <w:t>tutor</w:t>
+      </w:r>
+      <w:r>
+        <w:rPr>
+          <w:rFonts w:ascii="Century Gothic" w:hAnsi="Century Gothic"/>
+        </w:rPr>
+        <w:t>}}</w:t>
+      </w:r>
+      <w:r>
+        <w:rPr>
+          <w:rFonts w:ascii="Century Gothic" w:hAnsi="Century Gothic"/>
+        </w:rPr>
+        <w:t xml:space="preserve"> </w:t>
+      </w:r>
+      <w:r>
+        <w:rPr>
+          <w:rFonts w:ascii="Century Gothic" w:hAnsi="Century Gothic"/>
+        </w:rPr>
+        <w:t>con DNI</w:t>
+      </w:r>
+      <w:r>
+        <w:rPr>
+          <w:rFonts w:ascii="Century Gothic" w:hAnsi="Century Gothic"/>
+        </w:rPr>
+        <w:t xml:space="preserve"> </w:t>
+      </w:r>
+      <w:r>
+        <w:rPr>
+          <w:rFonts w:ascii="Century Gothic" w:hAnsi="Century Gothic"/>
+        </w:rPr>
+        <w:t>{{dni_</w:t>
+      </w:r>
+      <w:r>
+        <w:rPr>
+          <w:rFonts w:ascii="Century Gothic" w:hAnsi="Century Gothic"/>
+        </w:rPr>
+        <w:t>tutor</w:t>
+      </w:r>
+      <w:r>
+        <w:rPr>
+          <w:rFonts w:ascii="Century Gothic" w:hAnsi="Century Gothic"/>
+        </w:rPr>
+        <w:t>}}</w:t>
+      </w:r>
+    </w:p>
+    <w:p>
+      <w:pPr>
+        <w:ind w:left="170" w:firstLine="0"/>
+        <w:jc w:val="both"/>
+        <w:rPr>
+          <w:rFonts w:ascii="Century Gothic" w:hAnsi="Century Gothic"/>
+        </w:rPr>
+      </w:pPr>
+      <w:r>
+        <w:rPr>
+          <w:rFonts w:ascii="Century Gothic" w:hAnsi="Century Gothic"/>
+        </w:rPr>
+        <w:t xml:space="preserve">En calidad de </w:t>
+      </w:r>
+      <w:r>
+        <w:rPr>
+          <w:rFonts w:ascii="Century Gothic" w:hAnsi="Century Gothic"/>
+        </w:rPr>
+        <w:t>{{relacion_tutor}}</w:t>
+      </w:r>
+      <w:r>
+        <w:rPr>
+          <w:rFonts w:ascii="Century Gothic" w:hAnsi="Century Gothic"/>
+        </w:rPr>
+        <w:t xml:space="preserve"> decido, dentro de las opciones clínicas disponibles, dar mi conformidad libre, voluntaria y consciente para los tratamientos expuestos en el presente documento.</w:t>
+      </w:r>
+    </w:p>
+    <w:p>
+      <w:pPr>
+        <w:ind w:left="170" w:firstLine="0"/>
+        <w:jc w:val="both"/>
+        <w:rPr>
+          <w:rFonts w:ascii="Century Gothic" w:hAnsi="Century Gothic"/>
+        </w:rPr>
+      </w:pPr>
+      <w:r>
+        <w:rPr>
+          <w:rFonts w:ascii="Century Gothic" w:hAnsi="Century Gothic"/>
+        </w:rPr>
+        <w:t>En Valverde del Camino, a {{d</w:t>
+      </w:r>
+      <w:r>
+        <w:rPr>
+          <w:rFonts w:ascii="Century Gothic" w:hAnsi="Century Gothic"/>
+        </w:rPr>
+        <w:t>i</w:t>
+      </w:r>
+      <w:r>
+        <w:rPr>
+          <w:rFonts w:ascii="Century Gothic" w:hAnsi="Century Gothic"/>
+        </w:rPr>
         <w:t>a_firma</w:t>
       </w:r>
-      <w:proofErr w:type="spellEnd"/>
-      <w:r>
-        <w:rPr>
-          <w:rFonts w:ascii="Century Gothic" w:hAnsi="Century Gothic"/>
-        </w:rPr>
-        <w:t>}} de {{</w:t>
-      </w:r>
-      <w:proofErr w:type="spellStart"/>
-      <w:r>
-        <w:rPr>
-          <w:rFonts w:ascii="Century Gothic" w:hAnsi="Century Gothic"/>
-        </w:rPr>
-        <w:t>mes_firma</w:t>
-      </w:r>
-      <w:proofErr w:type="spellEnd"/>
-      <w:r>
-        <w:rPr>
-          <w:rFonts w:ascii="Century Gothic" w:hAnsi="Century Gothic"/>
-        </w:rPr>
-        <w:t>}} de {{</w:t>
-      </w:r>
-      <w:proofErr w:type="spellStart"/>
-      <w:r>
-        <w:rPr>
-          <w:rFonts w:ascii="Century Gothic" w:hAnsi="Century Gothic"/>
-        </w:rPr>
-        <w:t>ano_firma</w:t>
-      </w:r>
-      <w:proofErr w:type="spellEnd"/>
+      <w:r>
+        <w:rPr>
+          <w:rFonts w:ascii="Century Gothic" w:hAnsi="Century Gothic"/>
+        </w:rPr>
+        <w:t>_</w:t>
+      </w:r>
+      <w:r>
+        <w:rPr>
+          <w:rFonts w:ascii="Century Gothic" w:hAnsi="Century Gothic"/>
+        </w:rPr>
+        <w:t>rep</w:t>
+      </w:r>
+      <w:r>
+        <w:rPr>
+          <w:rFonts w:ascii="Century Gothic" w:hAnsi="Century Gothic"/>
+        </w:rPr>
+        <w:t>}} de {{mes_firma</w:t>
+      </w:r>
+      <w:r>
+        <w:rPr>
+          <w:rFonts w:ascii="Century Gothic" w:hAnsi="Century Gothic"/>
+        </w:rPr>
+        <w:t>_</w:t>
+      </w:r>
+      <w:r>
+        <w:rPr>
+          <w:rFonts w:ascii="Century Gothic" w:hAnsi="Century Gothic"/>
+        </w:rPr>
+        <w:t>rep</w:t>
+      </w:r>
+      <w:r>
+        <w:rPr>
+          <w:rFonts w:ascii="Century Gothic" w:hAnsi="Century Gothic"/>
+        </w:rPr>
+        <w:t>}} de {{ano_firma</w:t>
+      </w:r>
+      <w:r>
+        <w:rPr>
+          <w:rFonts w:ascii="Century Gothic" w:hAnsi="Century Gothic"/>
+        </w:rPr>
+        <w:t>_</w:t>
+      </w:r>
+      <w:r>
+        <w:rPr>
+          <w:rFonts w:ascii="Century Gothic" w:hAnsi="Century Gothic"/>
+        </w:rPr>
+        <w:t>rep</w:t>
+      </w:r>
       <w:r>
         <w:rPr>
           <w:rFonts w:ascii="Century Gothic" w:hAnsi="Century Gothic"/>
@@ -1552,8 +1569,27 @@
         <w:jc w:val="both"/>
         <w:rPr>
           <w:rFonts w:ascii="Century Gothic" w:hAnsi="Century Gothic"/>
-        </w:rPr>
-      </w:pPr>
+          <w:b/>
+        </w:rPr>
+      </w:pPr>
+    </w:p>
+    <w:p>
+      <w:pPr>
+        <w:jc w:val="both"/>
+        <w:rPr>
+          <w:rFonts w:ascii="Century Gothic" w:hAnsi="Century Gothic"/>
+          <w:b/>
+          <w:bCs/>
+        </w:rPr>
+      </w:pPr>
+      <w:r>
+        <w:rPr>
+          <w:rFonts w:ascii="Century Gothic" w:hAnsi="Century Gothic"/>
+          <w:b/>
+          <w:bCs/>
+        </w:rPr>
+        <w:t>Revocación consentimiento informado</w:t>
+      </w:r>
     </w:p>
     <w:p>
       <w:pPr>
@@ -1561,15 +1597,99 @@
         <w:jc w:val="both"/>
         <w:rPr>
           <w:rFonts w:ascii="Century Gothic" w:hAnsi="Century Gothic"/>
-          <w:b/>
-        </w:rPr>
-      </w:pPr>
-      <w:r>
-        <w:rPr>
-          <w:rFonts w:ascii="Century Gothic" w:hAnsi="Century Gothic"/>
-          <w:b/>
-        </w:rPr>
-        <w:t>Autorización de familiar o tutor</w:t>
+        </w:rPr>
+      </w:pPr>
+      <w:r>
+        <w:rPr>
+          <w:rFonts w:ascii="Century Gothic" w:hAnsi="Century Gothic"/>
+        </w:rPr>
+        <w:t xml:space="preserve">YO </w:t>
+      </w:r>
+      <w:r>
+        <w:rPr>
+          <w:rFonts w:ascii="Century Gothic" w:hAnsi="Century Gothic"/>
+        </w:rPr>
+        <w:t>{{nombre_</w:t>
+      </w:r>
+      <w:r>
+        <w:rPr>
+          <w:rFonts w:ascii="Century Gothic" w:hAnsi="Century Gothic"/>
+        </w:rPr>
+        <w:t>tutor_</w:t>
+      </w:r>
+      <w:r>
+        <w:rPr>
+          <w:rFonts w:ascii="Century Gothic" w:hAnsi="Century Gothic"/>
+        </w:rPr>
+        <w:t>revoc</w:t>
+      </w:r>
+      <w:r>
+        <w:rPr>
+          <w:rFonts w:ascii="Century Gothic" w:hAnsi="Century Gothic"/>
+        </w:rPr>
+        <w:t>}}</w:t>
+      </w:r>
+      <w:r>
+        <w:rPr>
+          <w:rFonts w:ascii="Century Gothic" w:hAnsi="Century Gothic"/>
+        </w:rPr>
+        <w:t xml:space="preserve"> por mi mismo en representación del paciente </w:t>
+      </w:r>
+      <w:r>
+        <w:rPr>
+          <w:rFonts w:ascii="Century Gothic" w:hAnsi="Century Gothic"/>
+        </w:rPr>
+        <w:t>{{nombre_paciente</w:t>
+      </w:r>
+      <w:r>
+        <w:rPr>
+          <w:rFonts w:ascii="Century Gothic" w:hAnsi="Century Gothic"/>
+        </w:rPr>
+        <w:t>_revoc</w:t>
+      </w:r>
+      <w:r>
+        <w:rPr>
+          <w:rFonts w:ascii="Century Gothic" w:hAnsi="Century Gothic"/>
+        </w:rPr>
+        <w:t>}}</w:t>
+      </w:r>
+      <w:r>
+        <w:rPr>
+          <w:rFonts w:ascii="Century Gothic" w:hAnsi="Century Gothic"/>
+        </w:rPr>
+        <w:t xml:space="preserve"> </w:t>
+      </w:r>
+      <w:r>
+        <w:rPr>
+          <w:rFonts w:ascii="Century Gothic" w:hAnsi="Century Gothic"/>
+          <w:b/>
+          <w:bCs/>
+        </w:rPr>
+        <w:t>REVOCO EL CONSENTIMIENTO PRESTADO EN FECHA</w:t>
+      </w:r>
+      <w:r>
+        <w:rPr>
+          <w:rFonts w:ascii="Century Gothic" w:hAnsi="Century Gothic"/>
+        </w:rPr>
+        <w:t xml:space="preserve"> </w:t>
+      </w:r>
+      <w:r>
+        <w:rPr>
+          <w:rFonts w:ascii="Century Gothic" w:hAnsi="Century Gothic"/>
+        </w:rPr>
+        <w:t>{{dia_firma_original}}/{{mes_num_firma_original}}/{{ano_firma_original}</w:t>
+      </w:r>
+      <w:r>
+        <w:rPr>
+          <w:rFonts w:ascii="Century Gothic" w:hAnsi="Century Gothic"/>
+        </w:rPr>
+        <w:t>}</w:t>
+      </w:r>
+      <w:r>
+        <w:rPr>
+          <w:rFonts w:ascii="Century Gothic" w:hAnsi="Century Gothic"/>
+        </w:rPr>
+        <w:t xml:space="preserve"> </w:t>
       </w:r>
     </w:p>
     <w:p>
@@ -1584,657 +1704,142 @@
         <w:rPr>
           <w:rFonts w:ascii="Century Gothic" w:hAnsi="Century Gothic"/>
         </w:rPr>
-        <w:t>Ante la imposibilidad de D/</w:t>
-      </w:r>
-      <w:proofErr w:type="spellStart"/>
-      <w:r>
-        <w:rPr>
-          <w:rFonts w:ascii="Century Gothic" w:hAnsi="Century Gothic"/>
-        </w:rPr>
-        <w:t>Dña</w:t>
-      </w:r>
-      <w:proofErr w:type="spellEnd"/>
-      <w:r>
-        <w:rPr>
-          <w:rFonts w:ascii="Century Gothic" w:hAnsi="Century Gothic"/>
-        </w:rPr>
-        <w:t xml:space="preserve"> </w:t>
-      </w:r>
-      <w:r>
-        <w:rPr>
-          <w:rFonts w:ascii="Century Gothic" w:hAnsi="Century Gothic"/>
-        </w:rPr>
-        <w:t>{{</w:t>
-      </w:r>
-      <w:proofErr w:type="spellStart"/>
-      <w:r>
-        <w:rPr>
-          <w:rFonts w:ascii="Century Gothic" w:hAnsi="Century Gothic"/>
-        </w:rPr>
-        <w:t>nombre_paciente_rep</w:t>
-      </w:r>
-      <w:proofErr w:type="spellEnd"/>
+        <w:t xml:space="preserve">Entiendo que, en caso que mi revocación se produzca ya iniciado el procedimiento/intervención, este podrá suspenderse solo si ello no me perjudica, siendo de mi cargo los gastos en que se haya incurrido. </w:t>
+      </w:r>
+    </w:p>
+    <w:p>
+      <w:pPr>
+        <w:ind w:left="170" w:firstLine="0"/>
+        <w:jc w:val="both"/>
+        <w:rPr>
+          <w:rFonts w:ascii="Century Gothic" w:hAnsi="Century Gothic"/>
+          <w:b/>
+          <w:bCs/>
+        </w:rPr>
+      </w:pPr>
+      <w:r>
+        <w:rPr>
+          <w:rFonts w:ascii="Century Gothic" w:hAnsi="Century Gothic"/>
+        </w:rPr>
+        <w:t xml:space="preserve">DECLARO, POR TANTO, tras la información recibida, </w:t>
+      </w:r>
+      <w:r>
+        <w:rPr>
+          <w:rFonts w:ascii="Century Gothic" w:hAnsi="Century Gothic"/>
+          <w:b/>
+          <w:bCs/>
+        </w:rPr>
+        <w:t xml:space="preserve">NO CONSIENTO LA REALIZACION DEL PROCEDIMIENTO/INTERVENCION YA INDICADO. </w:t>
+      </w:r>
+    </w:p>
+    <w:p>
+      <w:pPr>
+        <w:ind w:left="170" w:firstLine="0"/>
+        <w:jc w:val="both"/>
+        <w:rPr>
+          <w:rFonts w:ascii="Century Gothic" w:hAnsi="Century Gothic"/>
+        </w:rPr>
+      </w:pPr>
+      <w:r>
+        <w:rPr>
+          <w:rFonts w:ascii="Century Gothic" w:hAnsi="Century Gothic"/>
+        </w:rPr>
+        <w:t xml:space="preserve">OBSERVACIONES: </w:t>
+      </w:r>
+      <w:r>
+        <w:rPr>
+          <w:rFonts w:ascii="Century Gothic" w:hAnsi="Century Gothic"/>
+        </w:rPr>
+        <w:br/>
+        <w:t>{{observaciones</w:t>
+      </w:r>
+      <w:r>
+        <w:rPr>
+          <w:rFonts w:ascii="Century Gothic" w:hAnsi="Century Gothic"/>
+        </w:rPr>
+        <w:t>_revoc</w:t>
+      </w:r>
       <w:r>
         <w:rPr>
           <w:rFonts w:ascii="Century Gothic" w:hAnsi="Century Gothic"/>
         </w:rPr>
         <w:t>}}</w:t>
       </w:r>
-      <w:r>
-        <w:rPr>
-          <w:rFonts w:ascii="Century Gothic" w:hAnsi="Century Gothic"/>
-        </w:rPr>
-        <w:t xml:space="preserve"> con DNI</w:t>
-      </w:r>
-      <w:r>
-        <w:rPr>
-          <w:rFonts w:ascii="Century Gothic" w:hAnsi="Century Gothic"/>
-        </w:rPr>
-        <w:t xml:space="preserve"> </w:t>
-      </w:r>
-      <w:r>
-        <w:rPr>
-          <w:rFonts w:ascii="Century Gothic" w:hAnsi="Century Gothic"/>
-        </w:rPr>
-        <w:t>{{</w:t>
-      </w:r>
-      <w:proofErr w:type="spellStart"/>
-      <w:r>
-        <w:rPr>
-          <w:rFonts w:ascii="Century Gothic" w:hAnsi="Century Gothic"/>
-        </w:rPr>
-        <w:t>dni_paciente_rep</w:t>
-      </w:r>
-      <w:proofErr w:type="spellEnd"/>
+    </w:p>
+    <w:p>
+      <w:pPr>
+        <w:jc w:val="both"/>
+        <w:rPr>
+          <w:rFonts w:ascii="Century Gothic" w:hAnsi="Century Gothic"/>
+        </w:rPr>
+      </w:pPr>
+    </w:p>
+    <w:p>
+      <w:pPr>
+        <w:ind w:firstLine="0"/>
+      </w:pPr>
+      <w:r>
+        <w:rPr>
+          <w:rFonts w:ascii="Century Gothic" w:hAnsi="Century Gothic"/>
+        </w:rPr>
+        <w:t>En Valverde del Camino, a {{d</w:t>
+      </w:r>
+      <w:r>
+        <w:rPr>
+          <w:rFonts w:ascii="Century Gothic" w:hAnsi="Century Gothic"/>
+        </w:rPr>
+        <w:t>i</w:t>
+      </w:r>
+      <w:r>
+        <w:rPr>
+          <w:rFonts w:ascii="Century Gothic" w:hAnsi="Century Gothic"/>
+        </w:rPr>
+        <w:t>a_</w:t>
+      </w:r>
+      <w:r>
+        <w:rPr>
+          <w:rFonts w:ascii="Century Gothic" w:hAnsi="Century Gothic"/>
+        </w:rPr>
+        <w:t>revoc</w:t>
+      </w:r>
+      <w:r>
+        <w:rPr>
+          <w:rFonts w:ascii="Century Gothic" w:hAnsi="Century Gothic"/>
+        </w:rPr>
+        <w:t>}} de {{mes_</w:t>
+      </w:r>
+      <w:r>
+        <w:rPr>
+          <w:rFonts w:ascii="Century Gothic" w:hAnsi="Century Gothic"/>
+        </w:rPr>
+        <w:t>revoc</w:t>
+      </w:r>
+      <w:r>
+        <w:rPr>
+          <w:rFonts w:ascii="Century Gothic" w:hAnsi="Century Gothic"/>
+        </w:rPr>
+        <w:t>}} de {{ano_</w:t>
+      </w:r>
+      <w:r>
+        <w:rPr>
+          <w:rFonts w:ascii="Century Gothic" w:hAnsi="Century Gothic"/>
+        </w:rPr>
+        <w:t>revoc</w:t>
+      </w:r>
       <w:r>
         <w:rPr>
           <w:rFonts w:ascii="Century Gothic" w:hAnsi="Century Gothic"/>
         </w:rPr>
         <w:t>}}</w:t>
       </w:r>
-      <w:r>
-        <w:rPr>
-          <w:rFonts w:ascii="Century Gothic" w:hAnsi="Century Gothic"/>
-        </w:rPr>
-        <w:t xml:space="preserve"> de prestar autorización para los tratamientos expuestos en el presente documento de forma libre, voluntaria y consciente:</w:t>
-      </w:r>
-    </w:p>
-    <w:p>
-      <w:pPr>
-        <w:ind w:left="170" w:firstLine="0"/>
-        <w:jc w:val="both"/>
-        <w:rPr>
-          <w:rFonts w:ascii="Century Gothic" w:hAnsi="Century Gothic"/>
-        </w:rPr>
-      </w:pPr>
-      <w:r>
-        <w:rPr>
-          <w:rFonts w:ascii="Century Gothic" w:hAnsi="Century Gothic"/>
-        </w:rPr>
-        <w:t>D/</w:t>
-      </w:r>
-      <w:proofErr w:type="spellStart"/>
-      <w:r>
-        <w:rPr>
-          <w:rFonts w:ascii="Century Gothic" w:hAnsi="Century Gothic"/>
-        </w:rPr>
-        <w:t>Dña</w:t>
-      </w:r>
-      <w:proofErr w:type="spellEnd"/>
-      <w:r>
-        <w:rPr>
-          <w:rFonts w:ascii="Century Gothic" w:hAnsi="Century Gothic"/>
-        </w:rPr>
-        <w:t xml:space="preserve"> </w:t>
-      </w:r>
-      <w:r>
-        <w:rPr>
-          <w:rFonts w:ascii="Century Gothic" w:hAnsi="Century Gothic"/>
-        </w:rPr>
-        <w:t>{{</w:t>
-      </w:r>
-      <w:proofErr w:type="spellStart"/>
-      <w:r>
-        <w:rPr>
-          <w:rFonts w:ascii="Century Gothic" w:hAnsi="Century Gothic"/>
-        </w:rPr>
-        <w:t>nombre_</w:t>
-      </w:r>
-      <w:r>
-        <w:rPr>
-          <w:rFonts w:ascii="Century Gothic" w:hAnsi="Century Gothic"/>
-        </w:rPr>
-        <w:t>tutor</w:t>
-      </w:r>
-      <w:proofErr w:type="spellEnd"/>
-      <w:r>
-        <w:rPr>
-          <w:rFonts w:ascii="Century Gothic" w:hAnsi="Century Gothic"/>
-        </w:rPr>
-        <w:t>}}</w:t>
-      </w:r>
-      <w:r>
-        <w:rPr>
-          <w:rFonts w:ascii="Century Gothic" w:hAnsi="Century Gothic"/>
-        </w:rPr>
-        <w:t xml:space="preserve"> </w:t>
-      </w:r>
-      <w:r>
-        <w:rPr>
-          <w:rFonts w:ascii="Century Gothic" w:hAnsi="Century Gothic"/>
-        </w:rPr>
-        <w:t>con DNI</w:t>
-      </w:r>
-      <w:r>
-        <w:rPr>
-          <w:rFonts w:ascii="Century Gothic" w:hAnsi="Century Gothic"/>
-        </w:rPr>
-        <w:t xml:space="preserve"> </w:t>
-      </w:r>
-      <w:r>
-        <w:rPr>
-          <w:rFonts w:ascii="Century Gothic" w:hAnsi="Century Gothic"/>
-        </w:rPr>
-        <w:t>{{</w:t>
-      </w:r>
-      <w:proofErr w:type="spellStart"/>
-      <w:r>
-        <w:rPr>
-          <w:rFonts w:ascii="Century Gothic" w:hAnsi="Century Gothic"/>
-        </w:rPr>
-        <w:t>dni_</w:t>
-      </w:r>
-      <w:r>
-        <w:rPr>
-          <w:rFonts w:ascii="Century Gothic" w:hAnsi="Century Gothic"/>
-        </w:rPr>
-        <w:t>tutor</w:t>
-      </w:r>
-      <w:proofErr w:type="spellEnd"/>
-      <w:r>
-        <w:rPr>
-          <w:rFonts w:ascii="Century Gothic" w:hAnsi="Century Gothic"/>
-        </w:rPr>
-        <w:t>}}</w:t>
-      </w:r>
-    </w:p>
-    <w:p>
-      <w:pPr>
-        <w:ind w:left="170" w:firstLine="0"/>
-        <w:jc w:val="both"/>
-        <w:rPr>
-          <w:rFonts w:ascii="Century Gothic" w:hAnsi="Century Gothic"/>
-        </w:rPr>
-      </w:pPr>
-      <w:r>
-        <w:rPr>
-          <w:rFonts w:ascii="Century Gothic" w:hAnsi="Century Gothic"/>
-        </w:rPr>
-        <w:t xml:space="preserve">En calidad de </w:t>
-      </w:r>
-      <w:r>
-        <w:rPr>
-          <w:rFonts w:ascii="Century Gothic" w:hAnsi="Century Gothic"/>
-        </w:rPr>
-        <w:t>{{</w:t>
-      </w:r>
-      <w:proofErr w:type="spellStart"/>
-      <w:r>
-        <w:rPr>
-          <w:rFonts w:ascii="Century Gothic" w:hAnsi="Century Gothic"/>
-        </w:rPr>
-        <w:t>relacion_tutor</w:t>
-      </w:r>
-      <w:proofErr w:type="spellEnd"/>
-      <w:r>
-        <w:rPr>
-          <w:rFonts w:ascii="Century Gothic" w:hAnsi="Century Gothic"/>
-        </w:rPr>
-        <w:t>}}</w:t>
-      </w:r>
-      <w:r>
-        <w:rPr>
-          <w:rFonts w:ascii="Century Gothic" w:hAnsi="Century Gothic"/>
-        </w:rPr>
-        <w:t xml:space="preserve"> decido, dentro de las opciones clínicas disponibles, dar mi conformidad libre, voluntaria y consciente para los tratamientos expuestos en el presente documento.</w:t>
-      </w:r>
-    </w:p>
-    <w:p>
-      <w:pPr>
-        <w:ind w:left="170" w:firstLine="0"/>
-        <w:jc w:val="both"/>
-        <w:rPr>
-          <w:rFonts w:ascii="Century Gothic" w:hAnsi="Century Gothic"/>
-        </w:rPr>
-      </w:pPr>
-      <w:r>
-        <w:rPr>
-          <w:rFonts w:ascii="Century Gothic" w:hAnsi="Century Gothic"/>
-        </w:rPr>
-        <w:t>En Valverde del Camino, a {{</w:t>
-      </w:r>
-      <w:proofErr w:type="spellStart"/>
-      <w:r>
-        <w:rPr>
-          <w:rFonts w:ascii="Century Gothic" w:hAnsi="Century Gothic"/>
-        </w:rPr>
-        <w:t>d</w:t>
-      </w:r>
-      <w:r>
-        <w:rPr>
-          <w:rFonts w:ascii="Century Gothic" w:hAnsi="Century Gothic"/>
-        </w:rPr>
-        <w:t>i</w:t>
-      </w:r>
-      <w:r>
-        <w:rPr>
-          <w:rFonts w:ascii="Century Gothic" w:hAnsi="Century Gothic"/>
-        </w:rPr>
-        <w:t>a_firma</w:t>
-      </w:r>
-      <w:r>
-        <w:rPr>
-          <w:rFonts w:ascii="Century Gothic" w:hAnsi="Century Gothic"/>
-        </w:rPr>
-        <w:t>_</w:t>
-      </w:r>
-      <w:r>
-        <w:rPr>
-          <w:rFonts w:ascii="Century Gothic" w:hAnsi="Century Gothic"/>
-        </w:rPr>
-        <w:t>rep</w:t>
-      </w:r>
-      <w:proofErr w:type="spellEnd"/>
-      <w:r>
-        <w:rPr>
-          <w:rFonts w:ascii="Century Gothic" w:hAnsi="Century Gothic"/>
-        </w:rPr>
-        <w:t>}} de {{</w:t>
-      </w:r>
-      <w:proofErr w:type="spellStart"/>
-      <w:r>
-        <w:rPr>
-          <w:rFonts w:ascii="Century Gothic" w:hAnsi="Century Gothic"/>
-        </w:rPr>
-        <w:t>mes_firma</w:t>
-      </w:r>
-      <w:r>
-        <w:rPr>
-          <w:rFonts w:ascii="Century Gothic" w:hAnsi="Century Gothic"/>
-        </w:rPr>
-        <w:t>_</w:t>
-      </w:r>
-      <w:r>
-        <w:rPr>
-          <w:rFonts w:ascii="Century Gothic" w:hAnsi="Century Gothic"/>
-        </w:rPr>
-        <w:t>rep</w:t>
-      </w:r>
-      <w:proofErr w:type="spellEnd"/>
-      <w:r>
-        <w:rPr>
-          <w:rFonts w:ascii="Century Gothic" w:hAnsi="Century Gothic"/>
-        </w:rPr>
-        <w:t>}} de {{</w:t>
-      </w:r>
-      <w:proofErr w:type="spellStart"/>
-      <w:r>
-        <w:rPr>
-          <w:rFonts w:ascii="Century Gothic" w:hAnsi="Century Gothic"/>
-        </w:rPr>
-        <w:t>ano_firma</w:t>
-      </w:r>
-      <w:r>
-        <w:rPr>
-          <w:rFonts w:ascii="Century Gothic" w:hAnsi="Century Gothic"/>
-        </w:rPr>
-        <w:t>_</w:t>
-      </w:r>
-      <w:r>
-        <w:rPr>
-          <w:rFonts w:ascii="Century Gothic" w:hAnsi="Century Gothic"/>
-        </w:rPr>
-        <w:t>rep</w:t>
-      </w:r>
-      <w:proofErr w:type="spellEnd"/>
-      <w:r>
-        <w:rPr>
-          <w:rFonts w:ascii="Century Gothic" w:hAnsi="Century Gothic"/>
-        </w:rPr>
-        <w:t>}}</w:t>
-      </w:r>
-    </w:p>
-    <w:p>
-      <w:pPr>
-        <w:ind w:left="170" w:firstLine="0"/>
-        <w:jc w:val="both"/>
-        <w:rPr>
-          <w:rFonts w:ascii="Century Gothic" w:hAnsi="Century Gothic"/>
-          <w:b/>
-        </w:rPr>
-      </w:pPr>
-    </w:p>
-    <w:p>
-      <w:pPr>
-        <w:jc w:val="both"/>
-        <w:rPr>
-          <w:rFonts w:ascii="Century Gothic" w:hAnsi="Century Gothic"/>
-          <w:b/>
-          <w:bCs/>
-        </w:rPr>
-      </w:pPr>
-      <w:r>
-        <w:rPr>
-          <w:rFonts w:ascii="Century Gothic" w:hAnsi="Century Gothic"/>
-          <w:b/>
-          <w:bCs/>
-        </w:rPr>
-        <w:t>Revocación consentimiento informado</w:t>
-      </w:r>
-    </w:p>
-    <w:p>
-      <w:pPr>
-        <w:ind w:left="170" w:firstLine="0"/>
-        <w:jc w:val="both"/>
-        <w:rPr>
-          <w:rFonts w:ascii="Century Gothic" w:hAnsi="Century Gothic"/>
-        </w:rPr>
-      </w:pPr>
-      <w:r>
-        <w:rPr>
-          <w:rFonts w:ascii="Century Gothic" w:hAnsi="Century Gothic"/>
-        </w:rPr>
-        <w:t xml:space="preserve">YO </w:t>
-      </w:r>
-      <w:r>
-        <w:rPr>
-          <w:rFonts w:ascii="Century Gothic" w:hAnsi="Century Gothic"/>
-        </w:rPr>
-        <w:t>{{</w:t>
-      </w:r>
-      <w:proofErr w:type="spellStart"/>
-      <w:r>
-        <w:rPr>
-          <w:rFonts w:ascii="Century Gothic" w:hAnsi="Century Gothic"/>
-        </w:rPr>
-        <w:t>nombre_</w:t>
-      </w:r>
-      <w:r>
-        <w:rPr>
-          <w:rFonts w:ascii="Century Gothic" w:hAnsi="Century Gothic"/>
-        </w:rPr>
-        <w:t>tutor_</w:t>
-      </w:r>
-      <w:r>
-        <w:rPr>
-          <w:rFonts w:ascii="Century Gothic" w:hAnsi="Century Gothic"/>
-        </w:rPr>
-        <w:t>revoc</w:t>
-      </w:r>
-      <w:proofErr w:type="spellEnd"/>
-      <w:r>
-        <w:rPr>
-          <w:rFonts w:ascii="Century Gothic" w:hAnsi="Century Gothic"/>
-        </w:rPr>
-        <w:t>}}</w:t>
-      </w:r>
-      <w:r>
-        <w:rPr>
-          <w:rFonts w:ascii="Century Gothic" w:hAnsi="Century Gothic"/>
-        </w:rPr>
-        <w:t xml:space="preserve"> por </w:t>
-      </w:r>
-      <w:proofErr w:type="spellStart"/>
-      <w:r>
-        <w:rPr>
-          <w:rFonts w:ascii="Century Gothic" w:hAnsi="Century Gothic"/>
-        </w:rPr>
-        <w:t>mi</w:t>
-      </w:r>
-      <w:proofErr w:type="spellEnd"/>
-      <w:r>
-        <w:rPr>
-          <w:rFonts w:ascii="Century Gothic" w:hAnsi="Century Gothic"/>
-        </w:rPr>
-        <w:t xml:space="preserve"> mismo en representación del paciente </w:t>
-      </w:r>
-      <w:r>
-        <w:rPr>
-          <w:rFonts w:ascii="Century Gothic" w:hAnsi="Century Gothic"/>
-        </w:rPr>
-        <w:t>{{</w:t>
-      </w:r>
-      <w:proofErr w:type="spellStart"/>
-      <w:r>
-        <w:rPr>
-          <w:rFonts w:ascii="Century Gothic" w:hAnsi="Century Gothic"/>
-        </w:rPr>
-        <w:t>nombre_paciente</w:t>
-      </w:r>
-      <w:r>
-        <w:rPr>
-          <w:rFonts w:ascii="Century Gothic" w:hAnsi="Century Gothic"/>
-        </w:rPr>
-        <w:t>_revoc</w:t>
-      </w:r>
-      <w:proofErr w:type="spellEnd"/>
-      <w:r>
-        <w:rPr>
-          <w:rFonts w:ascii="Century Gothic" w:hAnsi="Century Gothic"/>
-        </w:rPr>
-        <w:t>}}</w:t>
-      </w:r>
-      <w:r>
-        <w:rPr>
-          <w:rFonts w:ascii="Century Gothic" w:hAnsi="Century Gothic"/>
-        </w:rPr>
-        <w:t xml:space="preserve"> </w:t>
-      </w:r>
-      <w:r>
-        <w:rPr>
-          <w:rFonts w:ascii="Century Gothic" w:hAnsi="Century Gothic"/>
-          <w:b/>
-          <w:bCs/>
-        </w:rPr>
-        <w:t>REVOCO EL CONSENTIMIENTO PRESTADO EN FECHA</w:t>
-      </w:r>
-      <w:r>
-        <w:rPr>
-          <w:rFonts w:ascii="Century Gothic" w:hAnsi="Century Gothic"/>
-        </w:rPr>
-        <w:t xml:space="preserve"> </w:t>
-      </w:r>
-      <w:r>
-        <w:rPr>
-          <w:rFonts w:ascii="Century Gothic" w:hAnsi="Century Gothic"/>
-        </w:rPr>
-        <w:t>{{dia_firma_original}}/{{mes_num_firma_original}}/{{ano_firma_original}</w:t>
-      </w:r>
-      <w:r>
-        <w:rPr>
-          <w:rFonts w:ascii="Century Gothic" w:hAnsi="Century Gothic"/>
-        </w:rPr>
-        <w:t>}</w:t>
-      </w:r>
-      <w:r>
-        <w:rPr>
-          <w:rFonts w:ascii="Century Gothic" w:hAnsi="Century Gothic"/>
-        </w:rPr>
-        <w:t xml:space="preserve"> </w:t>
-      </w:r>
-    </w:p>
-    <w:p>
-      <w:pPr>
-        <w:ind w:left="170" w:firstLine="0"/>
-        <w:jc w:val="both"/>
-        <w:rPr>
-          <w:rFonts w:ascii="Century Gothic" w:hAnsi="Century Gothic"/>
-        </w:rPr>
-      </w:pPr>
-      <w:r>
-        <w:rPr>
-          <w:rFonts w:ascii="Century Gothic" w:hAnsi="Century Gothic"/>
-        </w:rPr>
-        <w:t xml:space="preserve">Entiendo que, en caso que mi revocación se produzca ya iniciado el procedimiento/intervención, este podrá suspenderse solo si ello no me perjudica, siendo de mi cargo los gastos en que se haya incurrido. </w:t>
-      </w:r>
-    </w:p>
-    <w:p>
-      <w:pPr>
-        <w:ind w:left="170" w:firstLine="0"/>
-        <w:jc w:val="both"/>
-        <w:rPr>
-          <w:rFonts w:ascii="Century Gothic" w:hAnsi="Century Gothic"/>
-          <w:b/>
-          <w:bCs/>
-        </w:rPr>
-      </w:pPr>
-      <w:r>
-        <w:rPr>
-          <w:rFonts w:ascii="Century Gothic" w:hAnsi="Century Gothic"/>
-        </w:rPr>
-        <w:t xml:space="preserve">DECLARO, POR TANTO, tras la información recibida, </w:t>
-      </w:r>
-      <w:r>
-        <w:rPr>
-          <w:rFonts w:ascii="Century Gothic" w:hAnsi="Century Gothic"/>
-          <w:b/>
-          <w:bCs/>
-        </w:rPr>
-        <w:t xml:space="preserve">NO CONSIENTO LA REALIZACION DEL PROCEDIMIENTO/INTERVENCION YA INDICADO. </w:t>
-      </w:r>
-    </w:p>
-    <w:p>
-      <w:pPr>
-        <w:ind w:left="170" w:firstLine="0"/>
-        <w:jc w:val="both"/>
-        <w:rPr>
-          <w:rFonts w:ascii="Century Gothic" w:hAnsi="Century Gothic"/>
-        </w:rPr>
-      </w:pPr>
-      <w:r>
-        <w:rPr>
-          <w:rFonts w:ascii="Century Gothic" w:hAnsi="Century Gothic"/>
-        </w:rPr>
-        <w:t xml:space="preserve">OBSERVACIONES: </w:t>
-      </w:r>
-      <w:r>
-        <w:rPr>
-          <w:rFonts w:ascii="Century Gothic" w:hAnsi="Century Gothic"/>
-        </w:rPr>
-        <w:br/>
-        <w:t>{{</w:t>
-      </w:r>
-      <w:proofErr w:type="spellStart"/>
-      <w:r>
-        <w:rPr>
-          <w:rFonts w:ascii="Century Gothic" w:hAnsi="Century Gothic"/>
-        </w:rPr>
-        <w:t>observaciones</w:t>
-      </w:r>
-      <w:r>
-        <w:rPr>
-          <w:rFonts w:ascii="Century Gothic" w:hAnsi="Century Gothic"/>
-        </w:rPr>
-        <w:t>_revoc</w:t>
-      </w:r>
-      <w:proofErr w:type="spellEnd"/>
-      <w:r>
-        <w:rPr>
-          <w:rFonts w:ascii="Century Gothic" w:hAnsi="Century Gothic"/>
-        </w:rPr>
-        <w:t>}}</w:t>
-      </w:r>
-    </w:p>
-    <w:p>
-      <w:pPr>
-        <w:jc w:val="both"/>
-        <w:rPr>
-          <w:rFonts w:ascii="Century Gothic" w:hAnsi="Century Gothic"/>
-        </w:rPr>
-      </w:pPr>
     </w:p>
     <w:p>
       <w:pPr>
         <w:ind w:firstLine="0"/>
-      </w:pPr>
-      <w:r>
-        <w:rPr>
-          <w:rFonts w:ascii="Century Gothic" w:hAnsi="Century Gothic"/>
-        </w:rPr>
-        <w:t>En Valverde del Camino, a {{</w:t>
-      </w:r>
-      <w:proofErr w:type="spellStart"/>
-      <w:r>
-        <w:rPr>
-          <w:rFonts w:ascii="Century Gothic" w:hAnsi="Century Gothic"/>
-        </w:rPr>
-        <w:t>d</w:t>
-      </w:r>
-      <w:r>
-        <w:rPr>
-          <w:rFonts w:ascii="Century Gothic" w:hAnsi="Century Gothic"/>
-        </w:rPr>
-        <w:t>i</w:t>
-      </w:r>
-      <w:r>
-        <w:rPr>
-          <w:rFonts w:ascii="Century Gothic" w:hAnsi="Century Gothic"/>
-        </w:rPr>
-        <w:t>a_</w:t>
-      </w:r>
-      <w:r>
-        <w:rPr>
-          <w:rFonts w:ascii="Century Gothic" w:hAnsi="Century Gothic"/>
-        </w:rPr>
-        <w:t>revoc</w:t>
-      </w:r>
-      <w:proofErr w:type="spellEnd"/>
-      <w:r>
-        <w:rPr>
-          <w:rFonts w:ascii="Century Gothic" w:hAnsi="Century Gothic"/>
-        </w:rPr>
-        <w:t>}} de {{</w:t>
-      </w:r>
-      <w:proofErr w:type="spellStart"/>
-      <w:r>
-        <w:rPr>
-          <w:rFonts w:ascii="Century Gothic" w:hAnsi="Century Gothic"/>
-        </w:rPr>
-        <w:t>mes_</w:t>
-      </w:r>
-      <w:r>
-        <w:rPr>
-          <w:rFonts w:ascii="Century Gothic" w:hAnsi="Century Gothic"/>
-        </w:rPr>
-        <w:t>revoc</w:t>
-      </w:r>
-      <w:proofErr w:type="spellEnd"/>
-      <w:r>
-        <w:rPr>
-          <w:rFonts w:ascii="Century Gothic" w:hAnsi="Century Gothic"/>
-        </w:rPr>
-        <w:t>}} de {{</w:t>
-      </w:r>
-      <w:proofErr w:type="spellStart"/>
-      <w:r>
-        <w:rPr>
-          <w:rFonts w:ascii="Century Gothic" w:hAnsi="Century Gothic"/>
-        </w:rPr>
-        <w:t>ano_</w:t>
-      </w:r>
-      <w:r>
-        <w:rPr>
-          <w:rFonts w:ascii="Century Gothic" w:hAnsi="Century Gothic"/>
-        </w:rPr>
-        <w:t>revoc</w:t>
-      </w:r>
-      <w:proofErr w:type="spellEnd"/>
-      <w:r>
-        <w:rPr>
-          <w:rFonts w:ascii="Century Gothic" w:hAnsi="Century Gothic"/>
-        </w:rPr>
-        <w:t>}}</w:t>
-      </w:r>
+        <w:rPr>
+          <w:rFonts w:ascii="Century Gothic" w:hAnsi="Century Gothic"/>
+        </w:rPr>
+      </w:pPr>
     </w:p>
     <w:p>
       <w:pPr>
@@ -2262,35 +1867,13 @@
     </w:p>
     <w:p>
       <w:pPr>
-        <w:ind w:firstLine="0"/>
-        <w:rPr>
-          <w:rFonts w:ascii="Century Gothic" w:hAnsi="Century Gothic"/>
-        </w:rPr>
-      </w:pPr>
-    </w:p>
-    <w:p>
-      <w:pPr>
         <w:spacing w:line="259" w:lineRule="auto"/>
       </w:pPr>
       <w:r>
         <w:rPr>
           <w:rFonts w:ascii="Century Gothic" w:hAnsi="Century Gothic"/>
         </w:rPr>
-        <w:t>{{</w:t>
-      </w:r>
-      <w:proofErr w:type="spellStart"/>
-      <w:r>
-        <w:rPr>
-          <w:rFonts w:ascii="Century Gothic" w:hAnsi="Century Gothic"/>
-        </w:rPr>
-        <w:t>firma_paciente</w:t>
-      </w:r>
-      <w:proofErr w:type="spellEnd"/>
-      <w:r>
-        <w:rPr>
-          <w:rFonts w:ascii="Century Gothic" w:hAnsi="Century Gothic"/>
-        </w:rPr>
-        <w:t>}}</w:t>
+        <w:t>{{firma_paciente}}</w:t>
       </w:r>
       <w:r>
         <w:rPr>
@@ -2314,26 +1897,13 @@
         <w:rPr>
           <w:rFonts w:ascii="Century Gothic" w:hAnsi="Century Gothic"/>
         </w:rPr>
-        <w:tab/>
-      </w:r>
-      <w:r>
-        <w:rPr>
-          <w:rFonts w:ascii="Century Gothic" w:hAnsi="Century Gothic"/>
-        </w:rPr>
-        <w:tab/>
-      </w:r>
-      <w:r>
-        <w:rPr>
-          <w:rFonts w:ascii="Century Gothic" w:hAnsi="Century Gothic"/>
-        </w:rPr>
-        <w:tab/>
-      </w:r>
-      <w:r>
-        <w:rPr>
-          <w:rFonts w:ascii="Century Gothic" w:hAnsi="Century Gothic"/>
-        </w:rPr>
-        <w:tab/>
-        <w:t>      {{firma_tutor}} </w:t>
+        <w:t xml:space="preserve">      </w:t>
+      </w:r>
+      <w:r>
+        <w:rPr>
+          <w:rFonts w:ascii="Century Gothic" w:hAnsi="Century Gothic"/>
+        </w:rPr>
+        <w:t>{{firma_tutor}} </w:t>
       </w:r>
       <w:r>
         <w:tab/>
@@ -2502,23 +2072,7 @@
         <w:rFonts w:cstheme="minorHAnsi"/>
         <w:color w:val="767171" w:themeColor="background2" w:themeShade="80"/>
       </w:rPr>
-      <w:t xml:space="preserve">María Eugenia Romero Castilla- </w:t>
-    </w:r>
-    <w:proofErr w:type="spellStart"/>
-    <w:r>
-      <w:rPr>
-        <w:rFonts w:cstheme="minorHAnsi"/>
-        <w:color w:val="767171" w:themeColor="background2" w:themeShade="80"/>
-      </w:rPr>
-      <w:t>Nº</w:t>
-    </w:r>
-    <w:proofErr w:type="spellEnd"/>
-    <w:r>
-      <w:rPr>
-        <w:rFonts w:cstheme="minorHAnsi"/>
-        <w:color w:val="767171" w:themeColor="background2" w:themeShade="80"/>
-      </w:rPr>
-      <w:t xml:space="preserve"> de Colegiado: 7559</w:t>
+      <w:t>María Eugenia Romero Castilla- Nº de Colegiado: 7559</w:t>
     </w:r>
   </w:p>
   <w:p>
@@ -3238,6 +2792,7 @@
   <w:style w:type="character" w:default="1" w:styleId="Fuentedeprrafopredeter">
     <w:name w:val="Default Paragraph Font"/>
     <w:uiPriority w:val="1"/>
+    <w:semiHidden/>
     <w:unhideWhenUsed/>
   </w:style>
   <w:style w:type="table" w:default="1" w:styleId="Tablanormal">

</xml_diff>